<commit_message>
Rearranged images directory, added ray tracer image
</commit_message>
<xml_diff>
--- a/CV/CV.docx
+++ b/CV/CV.docx
@@ -213,13 +213,13 @@
         <w:t xml:space="preserve">Relevant </w:t>
       </w:r>
       <w:r>
-        <w:t xml:space="preserve">GCSEs </w:t>
-      </w:r>
-      <w:r>
-        <w:t>or</w:t>
-      </w:r>
-      <w:r>
-        <w:t xml:space="preserve"> Equivalent:</w:t>
+        <w:t>GCSEs</w:t>
+      </w:r>
+      <w:r>
+        <w:t>/</w:t>
+      </w:r>
+      <w:r>
+        <w:t>Equivalent:</w:t>
       </w:r>
       <w:r>
         <w:t xml:space="preserve"> </w:t>
@@ -429,10 +429,32 @@
     </w:p>
     <w:p>
       <w:r>
-        <w:t>Team Building – University group projects with other Games Programming students, along with Games Design and Game Art students.</w:t>
-      </w:r>
-    </w:p>
-    <w:p/>
+        <w:t xml:space="preserve">Team Building </w:t>
+      </w:r>
+      <w:r>
+        <w:t>and Collaboration</w:t>
+      </w:r>
+      <w:r>
+        <w:t xml:space="preserve"> </w:t>
+      </w:r>
+      <w:r>
+        <w:t>– University group projects with other Games Programming students, along with Games Design and Game Art students.</w:t>
+      </w:r>
+    </w:p>
+    <w:p>
+      <w:r>
+        <w:t>Presenting – Routinely present</w:t>
+      </w:r>
+      <w:r>
+        <w:t xml:space="preserve"> and demonstrate projects</w:t>
+      </w:r>
+      <w:r>
+        <w:t xml:space="preserve"> to </w:t>
+      </w:r>
+      <w:r>
+        <w:t>the Programming, Design, and Art courses</w:t>
+      </w:r>
+    </w:p>
     <w:p>
       <w:pPr>
         <w:pStyle w:val="Heading2"/>
@@ -493,9 +515,33 @@
         <w:t xml:space="preserve"> sets as well as ‘MOCs’</w:t>
       </w:r>
       <w:r>
+        <w:t xml:space="preserve"> wh</w:t>
+      </w:r>
+      <w:r>
+        <w:t>ich I build myself</w:t>
+      </w:r>
+      <w:r>
         <w:t>.</w:t>
       </w:r>
       <w:r>
+        <w:t xml:space="preserve"> Star Wars, Doctor Who,</w:t>
+      </w:r>
+      <w:r>
+        <w:t xml:space="preserve"> and</w:t>
+      </w:r>
+      <w:r>
+        <w:t xml:space="preserve"> Back to the </w:t>
+      </w:r>
+      <w:r>
+        <w:t>Future</w:t>
+      </w:r>
+      <w:r>
+        <w:t xml:space="preserve"> are among my favourite franchises so a lot of my Lego is based on that</w:t>
+      </w:r>
+      <w:r>
+        <w:t>.</w:t>
+      </w:r>
+      <w:r>
         <w:t xml:space="preserve"> </w:t>
       </w:r>
       <w:r>
@@ -505,7 +551,13 @@
         <w:t xml:space="preserve"> </w:t>
       </w:r>
       <w:r>
-        <w:t xml:space="preserve">Every Friday I go to the </w:t>
+        <w:t xml:space="preserve">Every Friday I </w:t>
+      </w:r>
+      <w:r>
+        <w:t>attend</w:t>
+      </w:r>
+      <w:r>
+        <w:t xml:space="preserve"> the </w:t>
       </w:r>
       <w:r>
         <w:t xml:space="preserve">Nintendo Society at </w:t>
@@ -521,6 +573,9 @@
       </w:r>
       <w:r>
         <w:t>made</w:t>
+      </w:r>
+      <w:r>
+        <w:t xml:space="preserve"> many</w:t>
       </w:r>
       <w:r>
         <w:t xml:space="preserve"> friends with lots of new people</w:t>

</xml_diff>

<commit_message>
Improving CV and updated boids page and video
</commit_message>
<xml_diff>
--- a/CV/CV.docx
+++ b/CV/CV.docx
@@ -599,171 +599,124 @@
               <w:bottom w:val="single" w:sz="8" w:space="0" w:color="648276" w:themeColor="accent5"/>
             </w:tcBorders>
           </w:tcPr>
-          <w:sdt>
-            <w:sdtPr>
-              <w:rPr>
-                <w:noProof/>
-                <w:lang w:val="en-GB"/>
-              </w:rPr>
-              <w:id w:val="-1767221959"/>
-              <w:placeholder>
-                <w:docPart w:val="CD18C203B8F145B9B32DF4C00581CF25"/>
-              </w:placeholder>
-              <w:temporary/>
-              <w:showingPlcHdr/>
-              <w15:appearance w15:val="hidden"/>
-              <w:text/>
-            </w:sdtPr>
-            <w:sdtContent>
-              <w:p>
-                <w:pPr>
-                  <w:pStyle w:val="Heading2"/>
-                  <w:rPr>
-                    <w:noProof/>
-                    <w:lang w:val="en-GB"/>
-                  </w:rPr>
-                </w:pPr>
-                <w:r>
-                  <w:rPr>
-                    <w:noProof/>
-                    <w:lang w:val="en-GB" w:bidi="en-GB"/>
-                  </w:rPr>
-                  <w:t>Experience</w:t>
-                </w:r>
-              </w:p>
-            </w:sdtContent>
-          </w:sdt>
           <w:p>
             <w:pPr>
-              <w:pStyle w:val="SmallText"/>
+              <w:pStyle w:val="Heading2"/>
               <w:rPr>
                 <w:noProof/>
                 <w:lang w:val="en-GB"/>
               </w:rPr>
             </w:pPr>
-            <w:sdt>
-              <w:sdtPr>
-                <w:rPr>
-                  <w:noProof/>
-                  <w:lang w:val="en-GB"/>
-                </w:rPr>
-                <w:id w:val="-170029467"/>
-                <w:placeholder>
-                  <w:docPart w:val="4F1DBFC578FD44299AB4D84B529C36A4"/>
-                </w:placeholder>
-                <w:temporary/>
-                <w:showingPlcHdr/>
-                <w15:appearance w15:val="hidden"/>
-                <w:text/>
-              </w:sdtPr>
-              <w:sdtContent>
-                <w:r>
-                  <w:rPr>
-                    <w:noProof/>
-                    <w:lang w:val="en-GB" w:bidi="en-GB"/>
-                  </w:rPr>
-                  <w:t>[Dates from] - [To]</w:t>
-                </w:r>
-              </w:sdtContent>
-            </w:sdt>
-          </w:p>
-          <w:p>
-            <w:pPr>
-              <w:pStyle w:val="TextRight"/>
+            <w:r>
               <w:rPr>
                 <w:noProof/>
                 <w:lang w:val="en-GB"/>
               </w:rPr>
+              <w:t>Education</w:t>
+            </w:r>
+          </w:p>
+          <w:p>
+            <w:pPr>
+              <w:pStyle w:val="TextLeft"/>
+              <w:jc w:val="left"/>
+              <w:rPr>
+                <w:rFonts w:asciiTheme="minorHAnsi" w:hAnsiTheme="minorHAnsi" w:cstheme="minorBidi"/>
+                <w:color w:val="auto"/>
+                <w:szCs w:val="22"/>
+                <w:lang w:val="en-GB"/>
+              </w:rPr>
             </w:pPr>
-            <w:sdt>
-              <w:sdtPr>
-                <w:rPr>
-                  <w:noProof/>
-                  <w:lang w:val="en-GB"/>
-                </w:rPr>
-                <w:id w:val="-1063243444"/>
-                <w:placeholder>
-                  <w:docPart w:val="4743E3FDC692440395AD439802FEDD97"/>
-                </w:placeholder>
-                <w:temporary/>
-                <w:showingPlcHdr/>
-                <w15:appearance w15:val="hidden"/>
-                <w:text/>
-              </w:sdtPr>
-              <w:sdtContent>
-                <w:r>
-                  <w:rPr>
-                    <w:noProof/>
-                    <w:lang w:val="en-GB" w:bidi="en-GB"/>
-                  </w:rPr>
-                  <w:t>[Job title]</w:t>
-                </w:r>
-              </w:sdtContent>
-            </w:sdt>
             <w:r>
               <w:rPr>
-                <w:noProof/>
-                <w:lang w:val="en-GB" w:bidi="en-GB"/>
+                <w:rFonts w:asciiTheme="minorHAnsi" w:hAnsiTheme="minorHAnsi" w:cstheme="minorBidi"/>
+                <w:color w:val="auto"/>
+                <w:szCs w:val="22"/>
+                <w:lang w:val="en-GB"/>
               </w:rPr>
-              <w:t xml:space="preserve"> • </w:t>
+              <w:t>Currently studying Level 5 BSc Computer Games Programming at the University of Gloucestershire.</w:t>
             </w:r>
-            <w:sdt>
-              <w:sdtPr>
-                <w:rPr>
-                  <w:noProof/>
-                  <w:lang w:val="en-GB"/>
-                </w:rPr>
-                <w:id w:val="116342317"/>
-                <w:placeholder>
-                  <w:docPart w:val="80E008DD60E8408F8F6F1BFB4FEE156D"/>
-                </w:placeholder>
-                <w:temporary/>
-                <w:showingPlcHdr/>
-                <w15:appearance w15:val="hidden"/>
-                <w:text/>
-              </w:sdtPr>
-              <w:sdtContent>
-                <w:r>
-                  <w:rPr>
-                    <w:noProof/>
-                    <w:lang w:val="en-GB" w:bidi="en-GB"/>
-                  </w:rPr>
-                  <w:t>[Job position]</w:t>
-                </w:r>
-              </w:sdtContent>
-            </w:sdt>
+          </w:p>
+          <w:p>
+            <w:pPr>
+              <w:pStyle w:val="TextLeft"/>
+              <w:jc w:val="left"/>
+              <w:rPr>
+                <w:rFonts w:asciiTheme="minorHAnsi" w:hAnsiTheme="minorHAnsi" w:cstheme="minorBidi"/>
+                <w:color w:val="auto"/>
+                <w:szCs w:val="22"/>
+                <w:lang w:val="en-GB"/>
+              </w:rPr>
+            </w:pPr>
             <w:r>
               <w:rPr>
-                <w:noProof/>
-                <w:lang w:val="en-GB" w:bidi="en-GB"/>
+                <w:rFonts w:asciiTheme="minorHAnsi" w:hAnsiTheme="minorHAnsi" w:cstheme="minorBidi"/>
+                <w:color w:val="auto"/>
+                <w:szCs w:val="22"/>
+                <w:lang w:val="en-GB"/>
               </w:rPr>
-              <w:t xml:space="preserve"> • </w:t>
+              <w:t xml:space="preserve">A Levels: Computer Science – A, </w:t>
             </w:r>
-            <w:sdt>
-              <w:sdtPr>
-                <w:rPr>
-                  <w:noProof/>
-                  <w:lang w:val="en-GB"/>
-                </w:rPr>
-                <w:id w:val="421921395"/>
-                <w:placeholder>
-                  <w:docPart w:val="85E113DF679D4B09A59B593A4666A1B5"/>
-                </w:placeholder>
-                <w:temporary/>
-                <w:showingPlcHdr/>
-                <w15:appearance w15:val="hidden"/>
-                <w:text/>
-              </w:sdtPr>
-              <w:sdtContent>
-                <w:r>
-                  <w:rPr>
-                    <w:noProof/>
-                    <w:lang w:val="en-GB" w:bidi="en-GB"/>
-                  </w:rPr>
-                  <w:t>[Company name]</w:t>
-                </w:r>
-              </w:sdtContent>
-            </w:sdt>
+            <w:proofErr w:type="spellStart"/>
+            <w:r>
+              <w:rPr>
+                <w:rFonts w:asciiTheme="minorHAnsi" w:hAnsiTheme="minorHAnsi" w:cstheme="minorBidi"/>
+                <w:color w:val="auto"/>
+                <w:szCs w:val="22"/>
+                <w:lang w:val="en-GB"/>
+              </w:rPr>
+              <w:t>Maths</w:t>
+            </w:r>
+            <w:proofErr w:type="spellEnd"/>
+            <w:r>
+              <w:rPr>
+                <w:rFonts w:asciiTheme="minorHAnsi" w:hAnsiTheme="minorHAnsi" w:cstheme="minorBidi"/>
+                <w:color w:val="auto"/>
+                <w:szCs w:val="22"/>
+                <w:lang w:val="en-GB"/>
+              </w:rPr>
+              <w:t xml:space="preserve"> – A, Physics – B</w:t>
+            </w:r>
+          </w:p>
+          <w:p>
+            <w:pPr>
+              <w:pStyle w:val="TextLeft"/>
+              <w:jc w:val="left"/>
+              <w:rPr>
+                <w:rFonts w:asciiTheme="minorHAnsi" w:hAnsiTheme="minorHAnsi" w:cstheme="minorBidi"/>
+                <w:color w:val="auto"/>
+                <w:szCs w:val="22"/>
+                <w:lang w:val="en-GB"/>
+              </w:rPr>
+            </w:pPr>
+            <w:r>
+              <w:rPr>
+                <w:rFonts w:asciiTheme="minorHAnsi" w:hAnsiTheme="minorHAnsi" w:cstheme="minorBidi"/>
+                <w:color w:val="auto"/>
+                <w:szCs w:val="22"/>
+                <w:lang w:val="en-GB"/>
+              </w:rPr>
+              <w:t xml:space="preserve">Relevant GCSEs/Equivalent: Computer Science – 9, Certificate in Digital Applications – A, </w:t>
+            </w:r>
+            <w:proofErr w:type="spellStart"/>
+            <w:r>
+              <w:rPr>
+                <w:rFonts w:asciiTheme="minorHAnsi" w:hAnsiTheme="minorHAnsi" w:cstheme="minorBidi"/>
+                <w:color w:val="auto"/>
+                <w:szCs w:val="22"/>
+                <w:lang w:val="en-GB"/>
+              </w:rPr>
+              <w:t>Maths</w:t>
+            </w:r>
+            <w:proofErr w:type="spellEnd"/>
+            <w:r>
+              <w:rPr>
+                <w:rFonts w:asciiTheme="minorHAnsi" w:hAnsiTheme="minorHAnsi" w:cstheme="minorBidi"/>
+                <w:color w:val="auto"/>
+                <w:szCs w:val="22"/>
+                <w:lang w:val="en-GB"/>
+              </w:rPr>
+              <w:t xml:space="preserve"> – 7, Combined Science Trilogy – 8-7, English Language – 7</w:t>
+            </w:r>
           </w:p>
           <w:p>
             <w:pPr>
@@ -774,342 +727,6 @@
                 <w:lang w:val="en-GB"/>
               </w:rPr>
             </w:pPr>
-          </w:p>
-          <w:p>
-            <w:pPr>
-              <w:pStyle w:val="SmallText"/>
-              <w:rPr>
-                <w:noProof/>
-                <w:lang w:val="en-GB"/>
-              </w:rPr>
-            </w:pPr>
-            <w:sdt>
-              <w:sdtPr>
-                <w:rPr>
-                  <w:noProof/>
-                  <w:lang w:val="en-GB"/>
-                </w:rPr>
-                <w:id w:val="1800105537"/>
-                <w:placeholder>
-                  <w:docPart w:val="7DDF6B8E77444E9787034FE4BA7EA0D5"/>
-                </w:placeholder>
-                <w:temporary/>
-                <w:showingPlcHdr/>
-                <w15:appearance w15:val="hidden"/>
-                <w:text/>
-              </w:sdtPr>
-              <w:sdtContent>
-                <w:r>
-                  <w:rPr>
-                    <w:noProof/>
-                    <w:lang w:val="en-GB" w:bidi="en-GB"/>
-                  </w:rPr>
-                  <w:t>[Dates from] - [To]</w:t>
-                </w:r>
-              </w:sdtContent>
-            </w:sdt>
-          </w:p>
-          <w:p>
-            <w:pPr>
-              <w:pStyle w:val="TextRight"/>
-              <w:rPr>
-                <w:noProof/>
-                <w:lang w:val="en-GB"/>
-              </w:rPr>
-            </w:pPr>
-            <w:sdt>
-              <w:sdtPr>
-                <w:rPr>
-                  <w:noProof/>
-                  <w:lang w:val="en-GB"/>
-                </w:rPr>
-                <w:id w:val="538326528"/>
-                <w:placeholder>
-                  <w:docPart w:val="E510BB89F7954ADAB91FD054BB3FBC42"/>
-                </w:placeholder>
-                <w:temporary/>
-                <w:showingPlcHdr/>
-                <w15:appearance w15:val="hidden"/>
-                <w:text/>
-              </w:sdtPr>
-              <w:sdtContent>
-                <w:r>
-                  <w:rPr>
-                    <w:noProof/>
-                    <w:lang w:val="en-GB" w:bidi="en-GB"/>
-                  </w:rPr>
-                  <w:t>[Job title]</w:t>
-                </w:r>
-              </w:sdtContent>
-            </w:sdt>
-            <w:r>
-              <w:rPr>
-                <w:noProof/>
-                <w:lang w:val="en-GB" w:bidi="en-GB"/>
-              </w:rPr>
-              <w:t xml:space="preserve"> • </w:t>
-            </w:r>
-            <w:sdt>
-              <w:sdtPr>
-                <w:rPr>
-                  <w:noProof/>
-                  <w:lang w:val="en-GB"/>
-                </w:rPr>
-                <w:id w:val="-285199606"/>
-                <w:placeholder>
-                  <w:docPart w:val="4AE3CBDA66A2480FBF7570101F0FAFE8"/>
-                </w:placeholder>
-                <w:temporary/>
-                <w:showingPlcHdr/>
-                <w15:appearance w15:val="hidden"/>
-                <w:text/>
-              </w:sdtPr>
-              <w:sdtContent>
-                <w:r>
-                  <w:rPr>
-                    <w:noProof/>
-                    <w:lang w:val="en-GB" w:bidi="en-GB"/>
-                  </w:rPr>
-                  <w:t>[Job position]</w:t>
-                </w:r>
-              </w:sdtContent>
-            </w:sdt>
-            <w:r>
-              <w:rPr>
-                <w:noProof/>
-                <w:lang w:val="en-GB" w:bidi="en-GB"/>
-              </w:rPr>
-              <w:t xml:space="preserve"> • </w:t>
-            </w:r>
-            <w:sdt>
-              <w:sdtPr>
-                <w:rPr>
-                  <w:noProof/>
-                  <w:lang w:val="en-GB"/>
-                </w:rPr>
-                <w:id w:val="1749461708"/>
-                <w:placeholder>
-                  <w:docPart w:val="E8E63B27BD064CC1B832168934361A46"/>
-                </w:placeholder>
-                <w:temporary/>
-                <w:showingPlcHdr/>
-                <w15:appearance w15:val="hidden"/>
-                <w:text/>
-              </w:sdtPr>
-              <w:sdtContent>
-                <w:r>
-                  <w:rPr>
-                    <w:noProof/>
-                    <w:lang w:val="en-GB" w:bidi="en-GB"/>
-                  </w:rPr>
-                  <w:t>[Company name]</w:t>
-                </w:r>
-              </w:sdtContent>
-            </w:sdt>
-          </w:p>
-          <w:p>
-            <w:pPr>
-              <w:pStyle w:val="TextRight"/>
-              <w:rPr>
-                <w:noProof/>
-                <w:sz w:val="21"/>
-                <w:lang w:val="en-GB"/>
-              </w:rPr>
-            </w:pPr>
-            <w:r>
-              <w:rPr>
-                <w:noProof/>
-                <w:sz w:val="21"/>
-                <w:szCs w:val="21"/>
-                <w:lang w:val="en-GB" w:bidi="en-GB"/>
-              </w:rPr>
-              <w:t xml:space="preserve"> </w:t>
-            </w:r>
-          </w:p>
-          <w:p>
-            <w:pPr>
-              <w:pStyle w:val="SmallText"/>
-              <w:rPr>
-                <w:noProof/>
-                <w:lang w:val="en-GB"/>
-              </w:rPr>
-            </w:pPr>
-            <w:sdt>
-              <w:sdtPr>
-                <w:rPr>
-                  <w:noProof/>
-                  <w:lang w:val="en-GB"/>
-                </w:rPr>
-                <w:id w:val="758651016"/>
-                <w:placeholder>
-                  <w:docPart w:val="F3E7C279290348F6BD40ED703D8F80A9"/>
-                </w:placeholder>
-                <w:temporary/>
-                <w:showingPlcHdr/>
-                <w15:appearance w15:val="hidden"/>
-                <w:text/>
-              </w:sdtPr>
-              <w:sdtContent>
-                <w:r>
-                  <w:rPr>
-                    <w:noProof/>
-                    <w:lang w:val="en-GB" w:bidi="en-GB"/>
-                  </w:rPr>
-                  <w:t>[Dates from] - [To]</w:t>
-                </w:r>
-              </w:sdtContent>
-            </w:sdt>
-          </w:p>
-          <w:p>
-            <w:pPr>
-              <w:pStyle w:val="TextRight"/>
-              <w:rPr>
-                <w:noProof/>
-                <w:lang w:val="en-GB"/>
-              </w:rPr>
-            </w:pPr>
-            <w:sdt>
-              <w:sdtPr>
-                <w:rPr>
-                  <w:noProof/>
-                  <w:lang w:val="en-GB"/>
-                </w:rPr>
-                <w:id w:val="1427684914"/>
-                <w:placeholder>
-                  <w:docPart w:val="6AA33C42FBC846DAA45AC8528665ADC8"/>
-                </w:placeholder>
-                <w:temporary/>
-                <w:showingPlcHdr/>
-                <w15:appearance w15:val="hidden"/>
-                <w:text/>
-              </w:sdtPr>
-              <w:sdtContent>
-                <w:r>
-                  <w:rPr>
-                    <w:noProof/>
-                    <w:lang w:val="en-GB" w:bidi="en-GB"/>
-                  </w:rPr>
-                  <w:t>[Job title]</w:t>
-                </w:r>
-              </w:sdtContent>
-            </w:sdt>
-            <w:r>
-              <w:rPr>
-                <w:noProof/>
-                <w:lang w:val="en-GB" w:bidi="en-GB"/>
-              </w:rPr>
-              <w:t xml:space="preserve"> • </w:t>
-            </w:r>
-            <w:sdt>
-              <w:sdtPr>
-                <w:rPr>
-                  <w:noProof/>
-                  <w:lang w:val="en-GB"/>
-                </w:rPr>
-                <w:id w:val="-104505620"/>
-                <w:placeholder>
-                  <w:docPart w:val="EA919C4D3A154D0783CDD71BAE1CC02D"/>
-                </w:placeholder>
-                <w:temporary/>
-                <w:showingPlcHdr/>
-                <w15:appearance w15:val="hidden"/>
-                <w:text/>
-              </w:sdtPr>
-              <w:sdtContent>
-                <w:r>
-                  <w:rPr>
-                    <w:noProof/>
-                    <w:lang w:val="en-GB" w:bidi="en-GB"/>
-                  </w:rPr>
-                  <w:t>[Job position]</w:t>
-                </w:r>
-              </w:sdtContent>
-            </w:sdt>
-            <w:r>
-              <w:rPr>
-                <w:noProof/>
-                <w:lang w:val="en-GB" w:bidi="en-GB"/>
-              </w:rPr>
-              <w:t xml:space="preserve"> • </w:t>
-            </w:r>
-            <w:sdt>
-              <w:sdtPr>
-                <w:rPr>
-                  <w:noProof/>
-                  <w:lang w:val="en-GB"/>
-                </w:rPr>
-                <w:id w:val="-926888980"/>
-                <w:placeholder>
-                  <w:docPart w:val="F465D8CC632942068F013554CB4977BE"/>
-                </w:placeholder>
-                <w:temporary/>
-                <w:showingPlcHdr/>
-                <w15:appearance w15:val="hidden"/>
-                <w:text/>
-              </w:sdtPr>
-              <w:sdtContent>
-                <w:r>
-                  <w:rPr>
-                    <w:noProof/>
-                    <w:lang w:val="en-GB" w:bidi="en-GB"/>
-                  </w:rPr>
-                  <w:t>[Company name]</w:t>
-                </w:r>
-              </w:sdtContent>
-            </w:sdt>
-          </w:p>
-          <w:p>
-            <w:pPr>
-              <w:pStyle w:val="TextRight"/>
-              <w:rPr>
-                <w:noProof/>
-                <w:sz w:val="21"/>
-                <w:lang w:val="en-GB"/>
-              </w:rPr>
-            </w:pPr>
-            <w:r>
-              <w:rPr>
-                <w:noProof/>
-                <w:sz w:val="21"/>
-                <w:szCs w:val="21"/>
-                <w:lang w:val="en-GB" w:bidi="en-GB"/>
-              </w:rPr>
-              <w:t xml:space="preserve"> </w:t>
-            </w:r>
-          </w:p>
-          <w:p>
-            <w:pPr>
-              <w:pStyle w:val="TextRight"/>
-              <w:rPr>
-                <w:noProof/>
-                <w:lang w:val="en-GB"/>
-              </w:rPr>
-            </w:pPr>
-            <w:sdt>
-              <w:sdtPr>
-                <w:rPr>
-                  <w:noProof/>
-                  <w:lang w:val="en-GB"/>
-                </w:rPr>
-                <w:id w:val="-87393142"/>
-                <w:placeholder>
-                  <w:docPart w:val="00EF0A34752148B2832CB3A664D0AB24"/>
-                </w:placeholder>
-                <w:temporary/>
-                <w:showingPlcHdr/>
-                <w15:appearance w15:val="hidden"/>
-                <w:text/>
-              </w:sdtPr>
-              <w:sdtContent>
-                <w:r>
-                  <w:rPr>
-                    <w:noProof/>
-                    <w:lang w:val="en-GB" w:bidi="en-GB"/>
-                  </w:rPr>
-                  <w:t>[This is the place for a brief summary of your key responsibilities and most stellar accomplishments.]</w:t>
-                </w:r>
-              </w:sdtContent>
-            </w:sdt>
           </w:p>
         </w:tc>
       </w:tr>
@@ -27254,412 +26871,6 @@
     </w:docPart>
     <w:docPart>
       <w:docPartPr>
-        <w:name w:val="CD18C203B8F145B9B32DF4C00581CF25"/>
-        <w:category>
-          <w:name w:val="General"/>
-          <w:gallery w:val="placeholder"/>
-        </w:category>
-        <w:types>
-          <w:type w:val="bbPlcHdr"/>
-        </w:types>
-        <w:behaviors>
-          <w:behavior w:val="content"/>
-        </w:behaviors>
-        <w:guid w:val="{2EECEB11-98C7-4CEC-B92E-00F593407F38}"/>
-      </w:docPartPr>
-      <w:docPartBody>
-        <w:p>
-          <w:pPr>
-            <w:pStyle w:val="CD18C203B8F145B9B32DF4C00581CF25"/>
-          </w:pPr>
-          <w:r>
-            <w:rPr>
-              <w:lang w:bidi="en-GB"/>
-            </w:rPr>
-            <w:t>Experience</w:t>
-          </w:r>
-        </w:p>
-      </w:docPartBody>
-    </w:docPart>
-    <w:docPart>
-      <w:docPartPr>
-        <w:name w:val="4F1DBFC578FD44299AB4D84B529C36A4"/>
-        <w:category>
-          <w:name w:val="General"/>
-          <w:gallery w:val="placeholder"/>
-        </w:category>
-        <w:types>
-          <w:type w:val="bbPlcHdr"/>
-        </w:types>
-        <w:behaviors>
-          <w:behavior w:val="content"/>
-        </w:behaviors>
-        <w:guid w:val="{008F253F-ECA4-4FB5-AA86-69405D2F6ED0}"/>
-      </w:docPartPr>
-      <w:docPartBody>
-        <w:p>
-          <w:pPr>
-            <w:pStyle w:val="4F1DBFC578FD44299AB4D84B529C36A4"/>
-          </w:pPr>
-          <w:r>
-            <w:rPr>
-              <w:lang w:bidi="en-GB"/>
-            </w:rPr>
-            <w:t>[Dates from] - [To]</w:t>
-          </w:r>
-        </w:p>
-      </w:docPartBody>
-    </w:docPart>
-    <w:docPart>
-      <w:docPartPr>
-        <w:name w:val="4743E3FDC692440395AD439802FEDD97"/>
-        <w:category>
-          <w:name w:val="General"/>
-          <w:gallery w:val="placeholder"/>
-        </w:category>
-        <w:types>
-          <w:type w:val="bbPlcHdr"/>
-        </w:types>
-        <w:behaviors>
-          <w:behavior w:val="content"/>
-        </w:behaviors>
-        <w:guid w:val="{D51B97A3-4788-4768-AE16-9FC3EF17E9E6}"/>
-      </w:docPartPr>
-      <w:docPartBody>
-        <w:p>
-          <w:pPr>
-            <w:pStyle w:val="4743E3FDC692440395AD439802FEDD97"/>
-          </w:pPr>
-          <w:r>
-            <w:rPr>
-              <w:lang w:bidi="en-GB"/>
-            </w:rPr>
-            <w:t>[Job title]</w:t>
-          </w:r>
-        </w:p>
-      </w:docPartBody>
-    </w:docPart>
-    <w:docPart>
-      <w:docPartPr>
-        <w:name w:val="80E008DD60E8408F8F6F1BFB4FEE156D"/>
-        <w:category>
-          <w:name w:val="General"/>
-          <w:gallery w:val="placeholder"/>
-        </w:category>
-        <w:types>
-          <w:type w:val="bbPlcHdr"/>
-        </w:types>
-        <w:behaviors>
-          <w:behavior w:val="content"/>
-        </w:behaviors>
-        <w:guid w:val="{9FBF1C0B-7D5A-4944-BCAC-601B3EA50402}"/>
-      </w:docPartPr>
-      <w:docPartBody>
-        <w:p>
-          <w:pPr>
-            <w:pStyle w:val="80E008DD60E8408F8F6F1BFB4FEE156D"/>
-          </w:pPr>
-          <w:r>
-            <w:rPr>
-              <w:lang w:bidi="en-GB"/>
-            </w:rPr>
-            <w:t>[Job position]</w:t>
-          </w:r>
-        </w:p>
-      </w:docPartBody>
-    </w:docPart>
-    <w:docPart>
-      <w:docPartPr>
-        <w:name w:val="85E113DF679D4B09A59B593A4666A1B5"/>
-        <w:category>
-          <w:name w:val="General"/>
-          <w:gallery w:val="placeholder"/>
-        </w:category>
-        <w:types>
-          <w:type w:val="bbPlcHdr"/>
-        </w:types>
-        <w:behaviors>
-          <w:behavior w:val="content"/>
-        </w:behaviors>
-        <w:guid w:val="{7D01BB70-6954-4723-8A18-D8E0C236006F}"/>
-      </w:docPartPr>
-      <w:docPartBody>
-        <w:p>
-          <w:pPr>
-            <w:pStyle w:val="85E113DF679D4B09A59B593A4666A1B5"/>
-          </w:pPr>
-          <w:r>
-            <w:rPr>
-              <w:lang w:bidi="en-GB"/>
-            </w:rPr>
-            <w:t>[Company name]</w:t>
-          </w:r>
-        </w:p>
-      </w:docPartBody>
-    </w:docPart>
-    <w:docPart>
-      <w:docPartPr>
-        <w:name w:val="7DDF6B8E77444E9787034FE4BA7EA0D5"/>
-        <w:category>
-          <w:name w:val="General"/>
-          <w:gallery w:val="placeholder"/>
-        </w:category>
-        <w:types>
-          <w:type w:val="bbPlcHdr"/>
-        </w:types>
-        <w:behaviors>
-          <w:behavior w:val="content"/>
-        </w:behaviors>
-        <w:guid w:val="{31A4F200-5718-4919-9EC2-E63574C031AD}"/>
-      </w:docPartPr>
-      <w:docPartBody>
-        <w:p>
-          <w:pPr>
-            <w:pStyle w:val="7DDF6B8E77444E9787034FE4BA7EA0D5"/>
-          </w:pPr>
-          <w:r>
-            <w:rPr>
-              <w:lang w:bidi="en-GB"/>
-            </w:rPr>
-            <w:t>[Dates from] - [To]</w:t>
-          </w:r>
-        </w:p>
-      </w:docPartBody>
-    </w:docPart>
-    <w:docPart>
-      <w:docPartPr>
-        <w:name w:val="E510BB89F7954ADAB91FD054BB3FBC42"/>
-        <w:category>
-          <w:name w:val="General"/>
-          <w:gallery w:val="placeholder"/>
-        </w:category>
-        <w:types>
-          <w:type w:val="bbPlcHdr"/>
-        </w:types>
-        <w:behaviors>
-          <w:behavior w:val="content"/>
-        </w:behaviors>
-        <w:guid w:val="{BE54E777-F214-4089-A42A-42EC8B872F96}"/>
-      </w:docPartPr>
-      <w:docPartBody>
-        <w:p>
-          <w:pPr>
-            <w:pStyle w:val="E510BB89F7954ADAB91FD054BB3FBC42"/>
-          </w:pPr>
-          <w:r>
-            <w:rPr>
-              <w:lang w:bidi="en-GB"/>
-            </w:rPr>
-            <w:t>[Job title]</w:t>
-          </w:r>
-        </w:p>
-      </w:docPartBody>
-    </w:docPart>
-    <w:docPart>
-      <w:docPartPr>
-        <w:name w:val="4AE3CBDA66A2480FBF7570101F0FAFE8"/>
-        <w:category>
-          <w:name w:val="General"/>
-          <w:gallery w:val="placeholder"/>
-        </w:category>
-        <w:types>
-          <w:type w:val="bbPlcHdr"/>
-        </w:types>
-        <w:behaviors>
-          <w:behavior w:val="content"/>
-        </w:behaviors>
-        <w:guid w:val="{92680398-AFEA-4B95-8932-1C425F0516A2}"/>
-      </w:docPartPr>
-      <w:docPartBody>
-        <w:p>
-          <w:pPr>
-            <w:pStyle w:val="4AE3CBDA66A2480FBF7570101F0FAFE8"/>
-          </w:pPr>
-          <w:r>
-            <w:rPr>
-              <w:lang w:bidi="en-GB"/>
-            </w:rPr>
-            <w:t>[Job position]</w:t>
-          </w:r>
-        </w:p>
-      </w:docPartBody>
-    </w:docPart>
-    <w:docPart>
-      <w:docPartPr>
-        <w:name w:val="E8E63B27BD064CC1B832168934361A46"/>
-        <w:category>
-          <w:name w:val="General"/>
-          <w:gallery w:val="placeholder"/>
-        </w:category>
-        <w:types>
-          <w:type w:val="bbPlcHdr"/>
-        </w:types>
-        <w:behaviors>
-          <w:behavior w:val="content"/>
-        </w:behaviors>
-        <w:guid w:val="{71408D80-E089-4301-9076-3B10A89381AE}"/>
-      </w:docPartPr>
-      <w:docPartBody>
-        <w:p>
-          <w:pPr>
-            <w:pStyle w:val="E8E63B27BD064CC1B832168934361A46"/>
-          </w:pPr>
-          <w:r>
-            <w:rPr>
-              <w:lang w:bidi="en-GB"/>
-            </w:rPr>
-            <w:t>[Company name]</w:t>
-          </w:r>
-        </w:p>
-      </w:docPartBody>
-    </w:docPart>
-    <w:docPart>
-      <w:docPartPr>
-        <w:name w:val="F3E7C279290348F6BD40ED703D8F80A9"/>
-        <w:category>
-          <w:name w:val="General"/>
-          <w:gallery w:val="placeholder"/>
-        </w:category>
-        <w:types>
-          <w:type w:val="bbPlcHdr"/>
-        </w:types>
-        <w:behaviors>
-          <w:behavior w:val="content"/>
-        </w:behaviors>
-        <w:guid w:val="{833FA4F4-F2FA-4601-B854-FC1D1C5633AF}"/>
-      </w:docPartPr>
-      <w:docPartBody>
-        <w:p>
-          <w:pPr>
-            <w:pStyle w:val="F3E7C279290348F6BD40ED703D8F80A9"/>
-          </w:pPr>
-          <w:r>
-            <w:rPr>
-              <w:lang w:bidi="en-GB"/>
-            </w:rPr>
-            <w:t>[Dates from] - [To]</w:t>
-          </w:r>
-        </w:p>
-      </w:docPartBody>
-    </w:docPart>
-    <w:docPart>
-      <w:docPartPr>
-        <w:name w:val="6AA33C42FBC846DAA45AC8528665ADC8"/>
-        <w:category>
-          <w:name w:val="General"/>
-          <w:gallery w:val="placeholder"/>
-        </w:category>
-        <w:types>
-          <w:type w:val="bbPlcHdr"/>
-        </w:types>
-        <w:behaviors>
-          <w:behavior w:val="content"/>
-        </w:behaviors>
-        <w:guid w:val="{4A79D60A-A598-4BF4-BF69-026BDBC8F7F0}"/>
-      </w:docPartPr>
-      <w:docPartBody>
-        <w:p>
-          <w:pPr>
-            <w:pStyle w:val="6AA33C42FBC846DAA45AC8528665ADC8"/>
-          </w:pPr>
-          <w:r>
-            <w:rPr>
-              <w:lang w:bidi="en-GB"/>
-            </w:rPr>
-            <w:t>[Job title]</w:t>
-          </w:r>
-        </w:p>
-      </w:docPartBody>
-    </w:docPart>
-    <w:docPart>
-      <w:docPartPr>
-        <w:name w:val="EA919C4D3A154D0783CDD71BAE1CC02D"/>
-        <w:category>
-          <w:name w:val="General"/>
-          <w:gallery w:val="placeholder"/>
-        </w:category>
-        <w:types>
-          <w:type w:val="bbPlcHdr"/>
-        </w:types>
-        <w:behaviors>
-          <w:behavior w:val="content"/>
-        </w:behaviors>
-        <w:guid w:val="{B3805AEE-57D8-490A-97A9-515F436D00EC}"/>
-      </w:docPartPr>
-      <w:docPartBody>
-        <w:p>
-          <w:pPr>
-            <w:pStyle w:val="EA919C4D3A154D0783CDD71BAE1CC02D"/>
-          </w:pPr>
-          <w:r>
-            <w:rPr>
-              <w:lang w:bidi="en-GB"/>
-            </w:rPr>
-            <w:t>[Job position]</w:t>
-          </w:r>
-        </w:p>
-      </w:docPartBody>
-    </w:docPart>
-    <w:docPart>
-      <w:docPartPr>
-        <w:name w:val="F465D8CC632942068F013554CB4977BE"/>
-        <w:category>
-          <w:name w:val="General"/>
-          <w:gallery w:val="placeholder"/>
-        </w:category>
-        <w:types>
-          <w:type w:val="bbPlcHdr"/>
-        </w:types>
-        <w:behaviors>
-          <w:behavior w:val="content"/>
-        </w:behaviors>
-        <w:guid w:val="{645AB62A-35E0-4C76-9981-EAB6FC9B03E6}"/>
-      </w:docPartPr>
-      <w:docPartBody>
-        <w:p>
-          <w:pPr>
-            <w:pStyle w:val="F465D8CC632942068F013554CB4977BE"/>
-          </w:pPr>
-          <w:r>
-            <w:rPr>
-              <w:lang w:bidi="en-GB"/>
-            </w:rPr>
-            <w:t>[Company name]</w:t>
-          </w:r>
-        </w:p>
-      </w:docPartBody>
-    </w:docPart>
-    <w:docPart>
-      <w:docPartPr>
-        <w:name w:val="00EF0A34752148B2832CB3A664D0AB24"/>
-        <w:category>
-          <w:name w:val="General"/>
-          <w:gallery w:val="placeholder"/>
-        </w:category>
-        <w:types>
-          <w:type w:val="bbPlcHdr"/>
-        </w:types>
-        <w:behaviors>
-          <w:behavior w:val="content"/>
-        </w:behaviors>
-        <w:guid w:val="{E04B9E99-541E-4F5F-B194-4E0B4D952906}"/>
-      </w:docPartPr>
-      <w:docPartBody>
-        <w:p>
-          <w:pPr>
-            <w:pStyle w:val="00EF0A34752148B2832CB3A664D0AB24"/>
-          </w:pPr>
-          <w:r>
-            <w:rPr>
-              <w:lang w:bidi="en-GB"/>
-            </w:rPr>
-            <w:t>[This is the place for a brief summary of your key responsibilities and most stellar accomplishments.]</w:t>
-          </w:r>
-        </w:p>
-      </w:docPartBody>
-    </w:docPart>
-    <w:docPart>
-      <w:docPartPr>
         <w:name w:val="60F34FF0416A4EE2ABD0143604CB291A"/>
         <w:category>
           <w:name w:val="General"/>
@@ -28061,6 +27272,7 @@
   </w:compat>
   <w:rsids>
     <w:rsidRoot w:val="008226FC"/>
+    <w:rsid w:val="003F03E2"/>
     <w:rsid w:val="005B0865"/>
     <w:rsid w:val="006107C4"/>
     <w:rsid w:val="008226FC"/>
@@ -28864,6 +28076,14 @@
 </file>
 
 <file path=customXml/item1.xml><?xml version="1.0" encoding="utf-8"?>
+<p:properties xmlns:p="http://schemas.microsoft.com/office/2006/metadata/properties" xmlns:xsi="http://www.w3.org/2001/XMLSchema-instance" xmlns:pc="http://schemas.microsoft.com/office/infopath/2007/PartnerControls">
+  <documentManagement>
+    <MediaServiceKeyPoints xmlns="71af3243-3dd4-4a8d-8c0d-dd76da1f02a5" xsi:nil="true"/>
+  </documentManagement>
+</p:properties>
+</file>
+
+<file path=customXml/item2.xml><?xml version="1.0" encoding="utf-8"?>
 <ct:contentTypeSchema xmlns:ct="http://schemas.microsoft.com/office/2006/metadata/contentType" xmlns:ma="http://schemas.microsoft.com/office/2006/metadata/properties/metaAttributes" ct:_="" ma:_="" ma:contentTypeName="Document" ma:contentTypeID="0x01010079F111ED35F8CC479449609E8A0923A6" ma:contentTypeVersion="11" ma:contentTypeDescription="Create a new document." ma:contentTypeScope="" ma:versionID="9677210f24a1be23c92c90fd886aa0aa">
   <xsd:schema xmlns:xsd="http://www.w3.org/2001/XMLSchema" xmlns:xs="http://www.w3.org/2001/XMLSchema" xmlns:p="http://schemas.microsoft.com/office/2006/metadata/properties" xmlns:ns2="71af3243-3dd4-4a8d-8c0d-dd76da1f02a5" xmlns:ns3="16c05727-aa75-4e4a-9b5f-8a80a1165891" targetNamespace="http://schemas.microsoft.com/office/2006/metadata/properties" ma:root="true" ma:fieldsID="60e05723c5c1908df1a1a4ebf11d344e" ns2:_="" ns3:_="">
     <xsd:import namespace="71af3243-3dd4-4a8d-8c0d-dd76da1f02a5"/>
@@ -29074,14 +28294,6 @@
 </ct:contentTypeSchema>
 </file>
 
-<file path=customXml/item2.xml><?xml version="1.0" encoding="utf-8"?>
-<p:properties xmlns:p="http://schemas.microsoft.com/office/2006/metadata/properties" xmlns:xsi="http://www.w3.org/2001/XMLSchema-instance" xmlns:pc="http://schemas.microsoft.com/office/infopath/2007/PartnerControls">
-  <documentManagement>
-    <MediaServiceKeyPoints xmlns="71af3243-3dd4-4a8d-8c0d-dd76da1f02a5" xsi:nil="true"/>
-  </documentManagement>
-</p:properties>
-</file>
-
 <file path=customXml/item3.xml><?xml version="1.0" encoding="utf-8"?>
 <?mso-contentType ?>
 <FormTemplates xmlns="http://schemas.microsoft.com/sharepoint/v3/contenttype/forms">
@@ -29092,6 +28304,16 @@
 </file>
 
 <file path=customXml/itemProps1.xml><?xml version="1.0" encoding="utf-8"?>
+<ds:datastoreItem xmlns:ds="http://schemas.openxmlformats.org/officeDocument/2006/customXml" ds:itemID="{24285919-CFDE-4EB8-9796-0DEB1CB8315E}">
+  <ds:schemaRefs>
+    <ds:schemaRef ds:uri="http://schemas.microsoft.com/office/2006/metadata/properties"/>
+    <ds:schemaRef ds:uri="http://schemas.microsoft.com/office/infopath/2007/PartnerControls"/>
+    <ds:schemaRef ds:uri="71af3243-3dd4-4a8d-8c0d-dd76da1f02a5"/>
+  </ds:schemaRefs>
+</ds:datastoreItem>
+</file>
+
+<file path=customXml/itemProps2.xml><?xml version="1.0" encoding="utf-8"?>
 <ds:datastoreItem xmlns:ds="http://schemas.openxmlformats.org/officeDocument/2006/customXml" ds:itemID="{12DA0656-155E-4034-8822-A568687ED651}">
   <ds:schemaRefs>
     <ds:schemaRef ds:uri="http://schemas.microsoft.com/office/2006/metadata/contentType"/>
@@ -29110,16 +28332,6 @@
 </ds:datastoreItem>
 </file>
 
-<file path=customXml/itemProps2.xml><?xml version="1.0" encoding="utf-8"?>
-<ds:datastoreItem xmlns:ds="http://schemas.openxmlformats.org/officeDocument/2006/customXml" ds:itemID="{24285919-CFDE-4EB8-9796-0DEB1CB8315E}">
-  <ds:schemaRefs>
-    <ds:schemaRef ds:uri="http://schemas.microsoft.com/office/2006/metadata/properties"/>
-    <ds:schemaRef ds:uri="http://schemas.microsoft.com/office/infopath/2007/PartnerControls"/>
-    <ds:schemaRef ds:uri="71af3243-3dd4-4a8d-8c0d-dd76da1f02a5"/>
-  </ds:schemaRefs>
-</ds:datastoreItem>
-</file>
-
 <file path=customXml/itemProps3.xml><?xml version="1.0" encoding="utf-8"?>
 <ds:datastoreItem xmlns:ds="http://schemas.openxmlformats.org/officeDocument/2006/customXml" ds:itemID="{50503A21-F367-462E-B624-BDB4831C4953}">
   <ds:schemaRefs>

</xml_diff>

<commit_message>
CV on one page
</commit_message>
<xml_diff>
--- a/CV/CV.docx
+++ b/CV/CV.docx
@@ -309,7 +309,7 @@
       </w:tr>
       <w:tr>
         <w:trPr>
-          <w:trHeight w:val="3688"/>
+          <w:trHeight w:val="2548"/>
         </w:trPr>
         <w:tc>
           <w:tcPr>
@@ -355,18 +355,21 @@
               </w:rPr>
               <w:t>C#</w:t>
             </w:r>
-          </w:p>
-          <w:p>
-            <w:pPr>
-              <w:pStyle w:val="TextLeft"/>
-              <w:jc w:val="left"/>
+            <w:r>
               <w:rPr>
                 <w:rFonts w:asciiTheme="minorHAnsi" w:hAnsiTheme="minorHAnsi" w:cstheme="minorBidi"/>
                 <w:color w:val="auto"/>
                 <w:szCs w:val="22"/>
                 <w:lang w:val="en-GB"/>
               </w:rPr>
-            </w:pPr>
+              <w:t>,</w:t>
+            </w:r>
+            <w:r>
+              <w:rPr>
+                <w:color w:val="auto"/>
+              </w:rPr>
+              <w:t xml:space="preserve"> </w:t>
+            </w:r>
             <w:r>
               <w:rPr>
                 <w:rFonts w:asciiTheme="minorHAnsi" w:hAnsiTheme="minorHAnsi" w:cstheme="minorBidi"/>
@@ -397,18 +400,21 @@
               </w:rPr>
               <w:t>Unity</w:t>
             </w:r>
-          </w:p>
-          <w:p>
-            <w:pPr>
-              <w:pStyle w:val="TextLeft"/>
-              <w:jc w:val="left"/>
+            <w:r>
               <w:rPr>
                 <w:rFonts w:asciiTheme="minorHAnsi" w:hAnsiTheme="minorHAnsi" w:cstheme="minorBidi"/>
                 <w:color w:val="auto"/>
                 <w:szCs w:val="22"/>
                 <w:lang w:val="en-GB"/>
               </w:rPr>
-            </w:pPr>
+              <w:t>,</w:t>
+            </w:r>
+            <w:r>
+              <w:rPr>
+                <w:color w:val="auto"/>
+              </w:rPr>
+              <w:t xml:space="preserve"> </w:t>
+            </w:r>
             <w:r>
               <w:rPr>
                 <w:rFonts w:asciiTheme="minorHAnsi" w:hAnsiTheme="minorHAnsi" w:cstheme="minorBidi"/>
@@ -418,18 +424,21 @@
               </w:rPr>
               <w:t>Unreal Engine 4</w:t>
             </w:r>
-          </w:p>
-          <w:p>
-            <w:pPr>
-              <w:pStyle w:val="TextLeft"/>
-              <w:jc w:val="left"/>
+            <w:r>
               <w:rPr>
                 <w:rFonts w:asciiTheme="minorHAnsi" w:hAnsiTheme="minorHAnsi" w:cstheme="minorBidi"/>
                 <w:color w:val="auto"/>
                 <w:szCs w:val="22"/>
                 <w:lang w:val="en-GB"/>
               </w:rPr>
-            </w:pPr>
+              <w:t>,</w:t>
+            </w:r>
+            <w:r>
+              <w:rPr>
+                <w:color w:val="auto"/>
+              </w:rPr>
+              <w:t xml:space="preserve"> </w:t>
+            </w:r>
             <w:r>
               <w:rPr>
                 <w:rFonts w:asciiTheme="minorHAnsi" w:hAnsiTheme="minorHAnsi" w:cstheme="minorBidi"/>
@@ -596,7 +605,7 @@
       </w:tr>
       <w:tr>
         <w:trPr>
-          <w:trHeight w:val="2375"/>
+          <w:trHeight w:val="2245"/>
         </w:trPr>
         <w:tc>
           <w:tcPr>
@@ -647,7 +656,8 @@
               <w:rPr>
                 <w:rFonts w:asciiTheme="minorHAnsi" w:hAnsiTheme="minorHAnsi" w:cstheme="minorBidi"/>
                 <w:color w:val="auto"/>
-                <w:szCs w:val="22"/>
+                <w:sz w:val="18"/>
+                <w:szCs w:val="18"/>
                 <w:lang w:val="en-GB"/>
               </w:rPr>
             </w:pPr>
@@ -655,7 +665,8 @@
               <w:rPr>
                 <w:rFonts w:asciiTheme="minorHAnsi" w:hAnsiTheme="minorHAnsi" w:cstheme="minorBidi"/>
                 <w:color w:val="auto"/>
-                <w:szCs w:val="22"/>
+                <w:sz w:val="18"/>
+                <w:szCs w:val="18"/>
                 <w:lang w:val="en-GB"/>
               </w:rPr>
               <w:t>Team Building/Collaboration – University group projects with other Games Programming students, along with Games Design and Game Art students.</w:t>
@@ -664,6 +675,8 @@
           <w:p>
             <w:pPr>
               <w:rPr>
+                <w:sz w:val="20"/>
+                <w:szCs w:val="20"/>
                 <w:lang w:val="en-GB"/>
               </w:rPr>
             </w:pPr>
@@ -675,7 +688,8 @@
               <w:rPr>
                 <w:rFonts w:asciiTheme="minorHAnsi" w:hAnsiTheme="minorHAnsi" w:cstheme="minorBidi"/>
                 <w:color w:val="auto"/>
-                <w:szCs w:val="22"/>
+                <w:sz w:val="18"/>
+                <w:szCs w:val="18"/>
                 <w:lang w:val="en-GB"/>
               </w:rPr>
             </w:pPr>
@@ -683,7 +697,8 @@
               <w:rPr>
                 <w:rFonts w:asciiTheme="minorHAnsi" w:hAnsiTheme="minorHAnsi" w:cstheme="minorBidi"/>
                 <w:color w:val="auto"/>
-                <w:szCs w:val="22"/>
+                <w:sz w:val="18"/>
+                <w:szCs w:val="18"/>
                 <w:lang w:val="en-GB"/>
               </w:rPr>
               <w:t>Presenting – Routinely present and demonstrate projects to the Programming, Design, and Art course students and lecturers.</w:t>
@@ -904,7 +919,6 @@
                 <w:szCs w:val="22"/>
                 <w:lang w:val="en-GB"/>
               </w:rPr>
-              <w:lastRenderedPageBreak/>
               <w:t xml:space="preserve">Minecraft is my most played game which I often play with my friends on our own servers. </w:t>
             </w:r>
             <w:r>
@@ -1117,7 +1131,7 @@
         </mc:Choice>
         <mc:Fallback>
           <w:pict>
-            <v:rect w14:anchorId="4E1F81F1" id="Rectangle 2" o:spid="_x0000_s1026" alt="&quot;&quot;" style="position:absolute;margin-left:36.45pt;margin-top:805.1pt;width:522.7pt;height:36.1pt;z-index:251659264;visibility:visible;mso-wrap-style:square;mso-width-percent:0;mso-height-percent:0;mso-wrap-distance-left:9pt;mso-wrap-distance-top:0;mso-wrap-distance-right:9pt;mso-wrap-distance-bottom:0;mso-position-horizontal:absolute;mso-position-horizontal-relative:page;mso-position-vertical:absolute;mso-position-vertical-relative:page;mso-width-percent:0;mso-height-percent:0;mso-width-relative:page;mso-height-relative:page;v-text-anchor:top" o:gfxdata="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" fillcolor="#604878 [3208]" stroked="f">
+            <v:rect w14:anchorId="4D6A6D88" id="Rectangle 2" o:spid="_x0000_s1026" alt="&quot;&quot;" style="position:absolute;margin-left:36.45pt;margin-top:805.1pt;width:522.7pt;height:36.1pt;z-index:251659264;visibility:visible;mso-wrap-style:square;mso-width-percent:0;mso-height-percent:0;mso-wrap-distance-left:9pt;mso-wrap-distance-top:0;mso-wrap-distance-right:9pt;mso-wrap-distance-bottom:0;mso-position-horizontal:absolute;mso-position-horizontal-relative:page;mso-position-vertical:absolute;mso-position-vertical-relative:page;mso-width-percent:0;mso-height-percent:0;mso-width-relative:page;mso-height-relative:page;v-text-anchor:top" o:gfxdata="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" fillcolor="#604878 [3208]" stroked="f">
               <w10:wrap anchorx="page" anchory="page"/>
             </v:rect>
           </w:pict>
@@ -26790,9 +26804,9 @@
   <w:rsids>
     <w:rsidRoot w:val="008226FC"/>
     <w:rsid w:val="003F03E2"/>
+    <w:rsid w:val="00565442"/>
     <w:rsid w:val="005B0865"/>
     <w:rsid w:val="006107C4"/>
-    <w:rsid w:val="00790A5C"/>
     <w:rsid w:val="008226FC"/>
   </w:rsids>
   <m:mathPr>

</xml_diff>

<commit_message>
Changed a font size, added PDF CV
</commit_message>
<xml_diff>
--- a/CV/CV.docx
+++ b/CV/CV.docx
@@ -1,6 +1,6 @@
 
 <file path=word/document.xml><?xml version="1.0" encoding="utf-8"?>
-<w:document xmlns:wpc="http://schemas.microsoft.com/office/word/2010/wordprocessingCanvas" xmlns:cx="http://schemas.microsoft.com/office/drawing/2014/chartex" xmlns:cx1="http://schemas.microsoft.com/office/drawing/2015/9/8/chartex" xmlns:cx2="http://schemas.microsoft.com/office/drawing/2015/10/21/chartex" xmlns:cx3="http://schemas.microsoft.com/office/drawing/2016/5/9/chartex" xmlns:cx4="http://schemas.microsoft.com/office/drawing/2016/5/10/chartex" xmlns:cx5="http://schemas.microsoft.com/office/drawing/2016/5/11/chartex" xmlns:cx6="http://schemas.microsoft.com/office/drawing/2016/5/12/chartex" xmlns:cx7="http://schemas.microsoft.com/office/drawing/2016/5/13/chartex" xmlns:cx8="http://schemas.microsoft.com/office/drawing/2016/5/14/chartex" xmlns:mc="http://schemas.openxmlformats.org/markup-compatibility/2006" xmlns:aink="http://schemas.microsoft.com/office/drawing/2016/ink" xmlns:am3d="http://schemas.microsoft.com/office/drawing/2017/model3d" xmlns:o="urn:schemas-microsoft-com:office:office" xmlns:oel="http://schemas.microsoft.com/office/2019/extlst" xmlns:r="http://schemas.openxmlformats.org/officeDocument/2006/relationships" xmlns:m="http://schemas.openxmlformats.org/officeDocument/2006/math" xmlns:v="urn:schemas-microsoft-com:vml" xmlns:wp14="http://schemas.microsoft.com/office/word/2010/wordprocessingDrawing" xmlns:wp="http://schemas.openxmlformats.org/drawingml/2006/wordprocessingDrawing" xmlns:w10="urn:schemas-microsoft-com:office:word" xmlns:w="http://schemas.openxmlformats.org/wordprocessingml/2006/main" xmlns:w14="http://schemas.microsoft.com/office/word/2010/wordml" xmlns:w15="http://schemas.microsoft.com/office/word/2012/wordml" xmlns:w16cex="http://schemas.microsoft.com/office/word/2018/wordml/cex" xmlns:w16cid="http://schemas.microsoft.com/office/word/2016/wordml/cid" xmlns:w16="http://schemas.microsoft.com/office/word/2018/wordml" xmlns:w16sdtdh="http://schemas.microsoft.com/office/word/2020/wordml/sdtdatahash" xmlns:w16se="http://schemas.microsoft.com/office/word/2015/wordml/symex" xmlns:wpg="http://schemas.microsoft.com/office/word/2010/wordprocessingGroup" xmlns:wpi="http://schemas.microsoft.com/office/word/2010/wordprocessingInk" xmlns:wne="http://schemas.microsoft.com/office/word/2006/wordml" xmlns:wps="http://schemas.microsoft.com/office/word/2010/wordprocessingShape" mc:Ignorable="w14 w15 w16se w16cid w16 w16cex w16sdtdh wp14">
+<w:document xmlns:wpc="http://schemas.microsoft.com/office/word/2010/wordprocessingCanvas" xmlns:cx="http://schemas.microsoft.com/office/drawing/2014/chartex" xmlns:cx1="http://schemas.microsoft.com/office/drawing/2015/9/8/chartex" xmlns:cx2="http://schemas.microsoft.com/office/drawing/2015/10/21/chartex" xmlns:cx3="http://schemas.microsoft.com/office/drawing/2016/5/9/chartex" xmlns:cx4="http://schemas.microsoft.com/office/drawing/2016/5/10/chartex" xmlns:cx5="http://schemas.microsoft.com/office/drawing/2016/5/11/chartex" xmlns:cx6="http://schemas.microsoft.com/office/drawing/2016/5/12/chartex" xmlns:cx7="http://schemas.microsoft.com/office/drawing/2016/5/13/chartex" xmlns:cx8="http://schemas.microsoft.com/office/drawing/2016/5/14/chartex" xmlns:mc="http://schemas.openxmlformats.org/markup-compatibility/2006" xmlns:aink="http://schemas.microsoft.com/office/drawing/2016/ink" xmlns:am3d="http://schemas.microsoft.com/office/drawing/2017/model3d" xmlns:o="urn:schemas-microsoft-com:office:office" xmlns:oel="http://schemas.microsoft.com/office/2019/extlst" xmlns:r="http://schemas.openxmlformats.org/officeDocument/2006/relationships" xmlns:m="http://schemas.openxmlformats.org/officeDocument/2006/math" xmlns:v="urn:schemas-microsoft-com:vml" xmlns:wp14="http://schemas.microsoft.com/office/word/2010/wordprocessingDrawing" xmlns:wp="http://schemas.openxmlformats.org/drawingml/2006/wordprocessingDrawing" xmlns:w10="urn:schemas-microsoft-com:office:word" xmlns:w="http://schemas.openxmlformats.org/wordprocessingml/2006/main" xmlns:w14="http://schemas.microsoft.com/office/word/2010/wordml" xmlns:w15="http://schemas.microsoft.com/office/word/2012/wordml" xmlns:w16cex="http://schemas.microsoft.com/office/word/2018/wordml/cex" xmlns:w16cid="http://schemas.microsoft.com/office/word/2016/wordml/cid" xmlns:w16="http://schemas.microsoft.com/office/word/2018/wordml" xmlns:w16du="http://schemas.microsoft.com/office/word/2023/wordml/word16du" xmlns:w16sdtdh="http://schemas.microsoft.com/office/word/2020/wordml/sdtdatahash" xmlns:w16se="http://schemas.microsoft.com/office/word/2015/wordml/symex" xmlns:wpg="http://schemas.microsoft.com/office/word/2010/wordprocessingGroup" xmlns:wpi="http://schemas.microsoft.com/office/word/2010/wordprocessingInk" xmlns:wne="http://schemas.microsoft.com/office/word/2006/wordml" xmlns:wps="http://schemas.microsoft.com/office/word/2010/wordprocessingShape" mc:Ignorable="w14 w15 w16se w16cid w16 w16cex w16sdtdh wp14">
   <w:body>
     <w:tbl>
       <w:tblPr>
@@ -224,17 +224,7 @@
                   <w:szCs w:val="22"/>
                   <w:lang w:val="en-GB"/>
                 </w:rPr>
-                <w:t>l</w:t>
-              </w:r>
-              <w:r>
-                <w:rPr>
-                  <w:rStyle w:val="Hyperlink"/>
-                  <w:rFonts w:asciiTheme="minorHAnsi" w:hAnsiTheme="minorHAnsi" w:cstheme="minorBidi"/>
-                  <w:color w:val="7030A0"/>
-                  <w:szCs w:val="22"/>
-                  <w:lang w:val="en-GB"/>
-                </w:rPr>
-                <w:t>yciastenson.github.io</w:t>
+                <w:t>lyciastenson.github.io</w:t>
               </w:r>
             </w:hyperlink>
           </w:p>
@@ -1037,7 +1027,7 @@
 </file>
 
 <file path=word/endnotes.xml><?xml version="1.0" encoding="utf-8"?>
-<w:endnotes xmlns:wpc="http://schemas.microsoft.com/office/word/2010/wordprocessingCanvas" xmlns:cx="http://schemas.microsoft.com/office/drawing/2014/chartex" xmlns:cx1="http://schemas.microsoft.com/office/drawing/2015/9/8/chartex" xmlns:cx2="http://schemas.microsoft.com/office/drawing/2015/10/21/chartex" xmlns:cx3="http://schemas.microsoft.com/office/drawing/2016/5/9/chartex" xmlns:cx4="http://schemas.microsoft.com/office/drawing/2016/5/10/chartex" xmlns:cx5="http://schemas.microsoft.com/office/drawing/2016/5/11/chartex" xmlns:cx6="http://schemas.microsoft.com/office/drawing/2016/5/12/chartex" xmlns:cx7="http://schemas.microsoft.com/office/drawing/2016/5/13/chartex" xmlns:cx8="http://schemas.microsoft.com/office/drawing/2016/5/14/chartex" xmlns:mc="http://schemas.openxmlformats.org/markup-compatibility/2006" xmlns:aink="http://schemas.microsoft.com/office/drawing/2016/ink" xmlns:am3d="http://schemas.microsoft.com/office/drawing/2017/model3d" xmlns:o="urn:schemas-microsoft-com:office:office" xmlns:oel="http://schemas.microsoft.com/office/2019/extlst" xmlns:r="http://schemas.openxmlformats.org/officeDocument/2006/relationships" xmlns:m="http://schemas.openxmlformats.org/officeDocument/2006/math" xmlns:v="urn:schemas-microsoft-com:vml" xmlns:wp14="http://schemas.microsoft.com/office/word/2010/wordprocessingDrawing" xmlns:wp="http://schemas.openxmlformats.org/drawingml/2006/wordprocessingDrawing" xmlns:w10="urn:schemas-microsoft-com:office:word" xmlns:w="http://schemas.openxmlformats.org/wordprocessingml/2006/main" xmlns:w14="http://schemas.microsoft.com/office/word/2010/wordml" xmlns:w15="http://schemas.microsoft.com/office/word/2012/wordml" xmlns:w16cex="http://schemas.microsoft.com/office/word/2018/wordml/cex" xmlns:w16cid="http://schemas.microsoft.com/office/word/2016/wordml/cid" xmlns:w16="http://schemas.microsoft.com/office/word/2018/wordml" xmlns:w16sdtdh="http://schemas.microsoft.com/office/word/2020/wordml/sdtdatahash" xmlns:w16se="http://schemas.microsoft.com/office/word/2015/wordml/symex" xmlns:wpg="http://schemas.microsoft.com/office/word/2010/wordprocessingGroup" xmlns:wpi="http://schemas.microsoft.com/office/word/2010/wordprocessingInk" xmlns:wne="http://schemas.microsoft.com/office/word/2006/wordml" xmlns:wps="http://schemas.microsoft.com/office/word/2010/wordprocessingShape" mc:Ignorable="w14 w15 w16se w16cid w16 w16cex w16sdtdh wp14">
+<w:endnotes xmlns:wpc="http://schemas.microsoft.com/office/word/2010/wordprocessingCanvas" xmlns:cx="http://schemas.microsoft.com/office/drawing/2014/chartex" xmlns:cx1="http://schemas.microsoft.com/office/drawing/2015/9/8/chartex" xmlns:cx2="http://schemas.microsoft.com/office/drawing/2015/10/21/chartex" xmlns:cx3="http://schemas.microsoft.com/office/drawing/2016/5/9/chartex" xmlns:cx4="http://schemas.microsoft.com/office/drawing/2016/5/10/chartex" xmlns:cx5="http://schemas.microsoft.com/office/drawing/2016/5/11/chartex" xmlns:cx6="http://schemas.microsoft.com/office/drawing/2016/5/12/chartex" xmlns:cx7="http://schemas.microsoft.com/office/drawing/2016/5/13/chartex" xmlns:cx8="http://schemas.microsoft.com/office/drawing/2016/5/14/chartex" xmlns:mc="http://schemas.openxmlformats.org/markup-compatibility/2006" xmlns:aink="http://schemas.microsoft.com/office/drawing/2016/ink" xmlns:am3d="http://schemas.microsoft.com/office/drawing/2017/model3d" xmlns:o="urn:schemas-microsoft-com:office:office" xmlns:oel="http://schemas.microsoft.com/office/2019/extlst" xmlns:r="http://schemas.openxmlformats.org/officeDocument/2006/relationships" xmlns:m="http://schemas.openxmlformats.org/officeDocument/2006/math" xmlns:v="urn:schemas-microsoft-com:vml" xmlns:wp14="http://schemas.microsoft.com/office/word/2010/wordprocessingDrawing" xmlns:wp="http://schemas.openxmlformats.org/drawingml/2006/wordprocessingDrawing" xmlns:w10="urn:schemas-microsoft-com:office:word" xmlns:w="http://schemas.openxmlformats.org/wordprocessingml/2006/main" xmlns:w14="http://schemas.microsoft.com/office/word/2010/wordml" xmlns:w15="http://schemas.microsoft.com/office/word/2012/wordml" xmlns:w16cex="http://schemas.microsoft.com/office/word/2018/wordml/cex" xmlns:w16cid="http://schemas.microsoft.com/office/word/2016/wordml/cid" xmlns:w16="http://schemas.microsoft.com/office/word/2018/wordml" xmlns:w16du="http://schemas.microsoft.com/office/word/2023/wordml/word16du" xmlns:w16sdtdh="http://schemas.microsoft.com/office/word/2020/wordml/sdtdatahash" xmlns:w16se="http://schemas.microsoft.com/office/word/2015/wordml/symex" xmlns:wpg="http://schemas.microsoft.com/office/word/2010/wordprocessingGroup" xmlns:wpi="http://schemas.microsoft.com/office/word/2010/wordprocessingInk" xmlns:wne="http://schemas.microsoft.com/office/word/2006/wordml" xmlns:wps="http://schemas.microsoft.com/office/word/2010/wordprocessingShape" mc:Ignorable="w14 w15 w16se w16cid w16 w16cex w16sdtdh wp14">
   <w:endnote w:type="separator" w:id="-1">
     <w:p>
       <w:r>
@@ -1056,7 +1046,7 @@
 </file>
 
 <file path=word/footer1.xml><?xml version="1.0" encoding="utf-8"?>
-<w:ftr xmlns:wpc="http://schemas.microsoft.com/office/word/2010/wordprocessingCanvas" xmlns:cx="http://schemas.microsoft.com/office/drawing/2014/chartex" xmlns:cx1="http://schemas.microsoft.com/office/drawing/2015/9/8/chartex" xmlns:cx2="http://schemas.microsoft.com/office/drawing/2015/10/21/chartex" xmlns:cx3="http://schemas.microsoft.com/office/drawing/2016/5/9/chartex" xmlns:cx4="http://schemas.microsoft.com/office/drawing/2016/5/10/chartex" xmlns:cx5="http://schemas.microsoft.com/office/drawing/2016/5/11/chartex" xmlns:cx6="http://schemas.microsoft.com/office/drawing/2016/5/12/chartex" xmlns:cx7="http://schemas.microsoft.com/office/drawing/2016/5/13/chartex" xmlns:cx8="http://schemas.microsoft.com/office/drawing/2016/5/14/chartex" xmlns:mc="http://schemas.openxmlformats.org/markup-compatibility/2006" xmlns:aink="http://schemas.microsoft.com/office/drawing/2016/ink" xmlns:am3d="http://schemas.microsoft.com/office/drawing/2017/model3d" xmlns:o="urn:schemas-microsoft-com:office:office" xmlns:oel="http://schemas.microsoft.com/office/2019/extlst" xmlns:r="http://schemas.openxmlformats.org/officeDocument/2006/relationships" xmlns:m="http://schemas.openxmlformats.org/officeDocument/2006/math" xmlns:v="urn:schemas-microsoft-com:vml" xmlns:wp14="http://schemas.microsoft.com/office/word/2010/wordprocessingDrawing" xmlns:wp="http://schemas.openxmlformats.org/drawingml/2006/wordprocessingDrawing" xmlns:w10="urn:schemas-microsoft-com:office:word" xmlns:w="http://schemas.openxmlformats.org/wordprocessingml/2006/main" xmlns:w14="http://schemas.microsoft.com/office/word/2010/wordml" xmlns:w15="http://schemas.microsoft.com/office/word/2012/wordml" xmlns:w16cex="http://schemas.microsoft.com/office/word/2018/wordml/cex" xmlns:w16cid="http://schemas.microsoft.com/office/word/2016/wordml/cid" xmlns:w16="http://schemas.microsoft.com/office/word/2018/wordml" xmlns:w16sdtdh="http://schemas.microsoft.com/office/word/2020/wordml/sdtdatahash" xmlns:w16se="http://schemas.microsoft.com/office/word/2015/wordml/symex" xmlns:wpg="http://schemas.microsoft.com/office/word/2010/wordprocessingGroup" xmlns:wpi="http://schemas.microsoft.com/office/word/2010/wordprocessingInk" xmlns:wne="http://schemas.microsoft.com/office/word/2006/wordml" xmlns:wps="http://schemas.microsoft.com/office/word/2010/wordprocessingShape" mc:Ignorable="w14 w15 w16se w16cid w16 w16cex w16sdtdh wp14">
+<w:ftr xmlns:wpc="http://schemas.microsoft.com/office/word/2010/wordprocessingCanvas" xmlns:cx="http://schemas.microsoft.com/office/drawing/2014/chartex" xmlns:cx1="http://schemas.microsoft.com/office/drawing/2015/9/8/chartex" xmlns:cx2="http://schemas.microsoft.com/office/drawing/2015/10/21/chartex" xmlns:cx3="http://schemas.microsoft.com/office/drawing/2016/5/9/chartex" xmlns:cx4="http://schemas.microsoft.com/office/drawing/2016/5/10/chartex" xmlns:cx5="http://schemas.microsoft.com/office/drawing/2016/5/11/chartex" xmlns:cx6="http://schemas.microsoft.com/office/drawing/2016/5/12/chartex" xmlns:cx7="http://schemas.microsoft.com/office/drawing/2016/5/13/chartex" xmlns:cx8="http://schemas.microsoft.com/office/drawing/2016/5/14/chartex" xmlns:mc="http://schemas.openxmlformats.org/markup-compatibility/2006" xmlns:aink="http://schemas.microsoft.com/office/drawing/2016/ink" xmlns:am3d="http://schemas.microsoft.com/office/drawing/2017/model3d" xmlns:o="urn:schemas-microsoft-com:office:office" xmlns:oel="http://schemas.microsoft.com/office/2019/extlst" xmlns:r="http://schemas.openxmlformats.org/officeDocument/2006/relationships" xmlns:m="http://schemas.openxmlformats.org/officeDocument/2006/math" xmlns:v="urn:schemas-microsoft-com:vml" xmlns:wp14="http://schemas.microsoft.com/office/word/2010/wordprocessingDrawing" xmlns:wp="http://schemas.openxmlformats.org/drawingml/2006/wordprocessingDrawing" xmlns:w10="urn:schemas-microsoft-com:office:word" xmlns:w="http://schemas.openxmlformats.org/wordprocessingml/2006/main" xmlns:w14="http://schemas.microsoft.com/office/word/2010/wordml" xmlns:w15="http://schemas.microsoft.com/office/word/2012/wordml" xmlns:w16cex="http://schemas.microsoft.com/office/word/2018/wordml/cex" xmlns:w16cid="http://schemas.microsoft.com/office/word/2016/wordml/cid" xmlns:w16="http://schemas.microsoft.com/office/word/2018/wordml" xmlns:w16du="http://schemas.microsoft.com/office/word/2023/wordml/word16du" xmlns:w16sdtdh="http://schemas.microsoft.com/office/word/2020/wordml/sdtdatahash" xmlns:w16se="http://schemas.microsoft.com/office/word/2015/wordml/symex" xmlns:wpg="http://schemas.microsoft.com/office/word/2010/wordprocessingGroup" xmlns:wpi="http://schemas.microsoft.com/office/word/2010/wordprocessingInk" xmlns:wne="http://schemas.microsoft.com/office/word/2006/wordml" xmlns:wps="http://schemas.microsoft.com/office/word/2010/wordprocessingShape" mc:Ignorable="w14 w15 w16se w16cid w16 w16cex w16sdtdh wp14">
   <w:p>
     <w:pPr>
       <w:pStyle w:val="Footer"/>
@@ -1143,7 +1133,7 @@
 </file>
 
 <file path=word/footnotes.xml><?xml version="1.0" encoding="utf-8"?>
-<w:footnotes xmlns:wpc="http://schemas.microsoft.com/office/word/2010/wordprocessingCanvas" xmlns:cx="http://schemas.microsoft.com/office/drawing/2014/chartex" xmlns:cx1="http://schemas.microsoft.com/office/drawing/2015/9/8/chartex" xmlns:cx2="http://schemas.microsoft.com/office/drawing/2015/10/21/chartex" xmlns:cx3="http://schemas.microsoft.com/office/drawing/2016/5/9/chartex" xmlns:cx4="http://schemas.microsoft.com/office/drawing/2016/5/10/chartex" xmlns:cx5="http://schemas.microsoft.com/office/drawing/2016/5/11/chartex" xmlns:cx6="http://schemas.microsoft.com/office/drawing/2016/5/12/chartex" xmlns:cx7="http://schemas.microsoft.com/office/drawing/2016/5/13/chartex" xmlns:cx8="http://schemas.microsoft.com/office/drawing/2016/5/14/chartex" xmlns:mc="http://schemas.openxmlformats.org/markup-compatibility/2006" xmlns:aink="http://schemas.microsoft.com/office/drawing/2016/ink" xmlns:am3d="http://schemas.microsoft.com/office/drawing/2017/model3d" xmlns:o="urn:schemas-microsoft-com:office:office" xmlns:oel="http://schemas.microsoft.com/office/2019/extlst" xmlns:r="http://schemas.openxmlformats.org/officeDocument/2006/relationships" xmlns:m="http://schemas.openxmlformats.org/officeDocument/2006/math" xmlns:v="urn:schemas-microsoft-com:vml" xmlns:wp14="http://schemas.microsoft.com/office/word/2010/wordprocessingDrawing" xmlns:wp="http://schemas.openxmlformats.org/drawingml/2006/wordprocessingDrawing" xmlns:w10="urn:schemas-microsoft-com:office:word" xmlns:w="http://schemas.openxmlformats.org/wordprocessingml/2006/main" xmlns:w14="http://schemas.microsoft.com/office/word/2010/wordml" xmlns:w15="http://schemas.microsoft.com/office/word/2012/wordml" xmlns:w16cex="http://schemas.microsoft.com/office/word/2018/wordml/cex" xmlns:w16cid="http://schemas.microsoft.com/office/word/2016/wordml/cid" xmlns:w16="http://schemas.microsoft.com/office/word/2018/wordml" xmlns:w16sdtdh="http://schemas.microsoft.com/office/word/2020/wordml/sdtdatahash" xmlns:w16se="http://schemas.microsoft.com/office/word/2015/wordml/symex" xmlns:wpg="http://schemas.microsoft.com/office/word/2010/wordprocessingGroup" xmlns:wpi="http://schemas.microsoft.com/office/word/2010/wordprocessingInk" xmlns:wne="http://schemas.microsoft.com/office/word/2006/wordml" xmlns:wps="http://schemas.microsoft.com/office/word/2010/wordprocessingShape" mc:Ignorable="w14 w15 w16se w16cid w16 w16cex w16sdtdh wp14">
+<w:footnotes xmlns:wpc="http://schemas.microsoft.com/office/word/2010/wordprocessingCanvas" xmlns:cx="http://schemas.microsoft.com/office/drawing/2014/chartex" xmlns:cx1="http://schemas.microsoft.com/office/drawing/2015/9/8/chartex" xmlns:cx2="http://schemas.microsoft.com/office/drawing/2015/10/21/chartex" xmlns:cx3="http://schemas.microsoft.com/office/drawing/2016/5/9/chartex" xmlns:cx4="http://schemas.microsoft.com/office/drawing/2016/5/10/chartex" xmlns:cx5="http://schemas.microsoft.com/office/drawing/2016/5/11/chartex" xmlns:cx6="http://schemas.microsoft.com/office/drawing/2016/5/12/chartex" xmlns:cx7="http://schemas.microsoft.com/office/drawing/2016/5/13/chartex" xmlns:cx8="http://schemas.microsoft.com/office/drawing/2016/5/14/chartex" xmlns:mc="http://schemas.openxmlformats.org/markup-compatibility/2006" xmlns:aink="http://schemas.microsoft.com/office/drawing/2016/ink" xmlns:am3d="http://schemas.microsoft.com/office/drawing/2017/model3d" xmlns:o="urn:schemas-microsoft-com:office:office" xmlns:oel="http://schemas.microsoft.com/office/2019/extlst" xmlns:r="http://schemas.openxmlformats.org/officeDocument/2006/relationships" xmlns:m="http://schemas.openxmlformats.org/officeDocument/2006/math" xmlns:v="urn:schemas-microsoft-com:vml" xmlns:wp14="http://schemas.microsoft.com/office/word/2010/wordprocessingDrawing" xmlns:wp="http://schemas.openxmlformats.org/drawingml/2006/wordprocessingDrawing" xmlns:w10="urn:schemas-microsoft-com:office:word" xmlns:w="http://schemas.openxmlformats.org/wordprocessingml/2006/main" xmlns:w14="http://schemas.microsoft.com/office/word/2010/wordml" xmlns:w15="http://schemas.microsoft.com/office/word/2012/wordml" xmlns:w16cex="http://schemas.microsoft.com/office/word/2018/wordml/cex" xmlns:w16cid="http://schemas.microsoft.com/office/word/2016/wordml/cid" xmlns:w16="http://schemas.microsoft.com/office/word/2018/wordml" xmlns:w16du="http://schemas.microsoft.com/office/word/2023/wordml/word16du" xmlns:w16sdtdh="http://schemas.microsoft.com/office/word/2020/wordml/sdtdatahash" xmlns:w16se="http://schemas.microsoft.com/office/word/2015/wordml/symex" xmlns:wpg="http://schemas.microsoft.com/office/word/2010/wordprocessingGroup" xmlns:wpi="http://schemas.microsoft.com/office/word/2010/wordprocessingInk" xmlns:wne="http://schemas.microsoft.com/office/word/2006/wordml" xmlns:wps="http://schemas.microsoft.com/office/word/2010/wordprocessingShape" mc:Ignorable="w14 w15 w16se w16cid w16 w16cex w16sdtdh wp14">
   <w:footnote w:type="separator" w:id="-1">
     <w:p>
       <w:r>
@@ -1162,7 +1152,7 @@
 </file>
 
 <file path=word/numbering.xml><?xml version="1.0" encoding="utf-8"?>
-<w:numbering xmlns:wpc="http://schemas.microsoft.com/office/word/2010/wordprocessingCanvas" xmlns:cx="http://schemas.microsoft.com/office/drawing/2014/chartex" xmlns:cx1="http://schemas.microsoft.com/office/drawing/2015/9/8/chartex" xmlns:cx2="http://schemas.microsoft.com/office/drawing/2015/10/21/chartex" xmlns:cx3="http://schemas.microsoft.com/office/drawing/2016/5/9/chartex" xmlns:cx4="http://schemas.microsoft.com/office/drawing/2016/5/10/chartex" xmlns:cx5="http://schemas.microsoft.com/office/drawing/2016/5/11/chartex" xmlns:cx6="http://schemas.microsoft.com/office/drawing/2016/5/12/chartex" xmlns:cx7="http://schemas.microsoft.com/office/drawing/2016/5/13/chartex" xmlns:cx8="http://schemas.microsoft.com/office/drawing/2016/5/14/chartex" xmlns:mc="http://schemas.openxmlformats.org/markup-compatibility/2006" xmlns:aink="http://schemas.microsoft.com/office/drawing/2016/ink" xmlns:am3d="http://schemas.microsoft.com/office/drawing/2017/model3d" xmlns:o="urn:schemas-microsoft-com:office:office" xmlns:oel="http://schemas.microsoft.com/office/2019/extlst" xmlns:r="http://schemas.openxmlformats.org/officeDocument/2006/relationships" xmlns:m="http://schemas.openxmlformats.org/officeDocument/2006/math" xmlns:v="urn:schemas-microsoft-com:vml" xmlns:wp14="http://schemas.microsoft.com/office/word/2010/wordprocessingDrawing" xmlns:wp="http://schemas.openxmlformats.org/drawingml/2006/wordprocessingDrawing" xmlns:w10="urn:schemas-microsoft-com:office:word" xmlns:w="http://schemas.openxmlformats.org/wordprocessingml/2006/main" xmlns:w14="http://schemas.microsoft.com/office/word/2010/wordml" xmlns:w15="http://schemas.microsoft.com/office/word/2012/wordml" xmlns:w16cex="http://schemas.microsoft.com/office/word/2018/wordml/cex" xmlns:w16cid="http://schemas.microsoft.com/office/word/2016/wordml/cid" xmlns:w16="http://schemas.microsoft.com/office/word/2018/wordml" xmlns:w16sdtdh="http://schemas.microsoft.com/office/word/2020/wordml/sdtdatahash" xmlns:w16se="http://schemas.microsoft.com/office/word/2015/wordml/symex" xmlns:wpg="http://schemas.microsoft.com/office/word/2010/wordprocessingGroup" xmlns:wpi="http://schemas.microsoft.com/office/word/2010/wordprocessingInk" xmlns:wne="http://schemas.microsoft.com/office/word/2006/wordml" xmlns:wps="http://schemas.microsoft.com/office/word/2010/wordprocessingShape" mc:Ignorable="w14 w15 w16se w16cid w16 w16cex w16sdtdh wp14">
+<w:numbering xmlns:wpc="http://schemas.microsoft.com/office/word/2010/wordprocessingCanvas" xmlns:cx="http://schemas.microsoft.com/office/drawing/2014/chartex" xmlns:cx1="http://schemas.microsoft.com/office/drawing/2015/9/8/chartex" xmlns:cx2="http://schemas.microsoft.com/office/drawing/2015/10/21/chartex" xmlns:cx3="http://schemas.microsoft.com/office/drawing/2016/5/9/chartex" xmlns:cx4="http://schemas.microsoft.com/office/drawing/2016/5/10/chartex" xmlns:cx5="http://schemas.microsoft.com/office/drawing/2016/5/11/chartex" xmlns:cx6="http://schemas.microsoft.com/office/drawing/2016/5/12/chartex" xmlns:cx7="http://schemas.microsoft.com/office/drawing/2016/5/13/chartex" xmlns:cx8="http://schemas.microsoft.com/office/drawing/2016/5/14/chartex" xmlns:mc="http://schemas.openxmlformats.org/markup-compatibility/2006" xmlns:aink="http://schemas.microsoft.com/office/drawing/2016/ink" xmlns:am3d="http://schemas.microsoft.com/office/drawing/2017/model3d" xmlns:o="urn:schemas-microsoft-com:office:office" xmlns:oel="http://schemas.microsoft.com/office/2019/extlst" xmlns:r="http://schemas.openxmlformats.org/officeDocument/2006/relationships" xmlns:m="http://schemas.openxmlformats.org/officeDocument/2006/math" xmlns:v="urn:schemas-microsoft-com:vml" xmlns:wp14="http://schemas.microsoft.com/office/word/2010/wordprocessingDrawing" xmlns:wp="http://schemas.openxmlformats.org/drawingml/2006/wordprocessingDrawing" xmlns:w10="urn:schemas-microsoft-com:office:word" xmlns:w="http://schemas.openxmlformats.org/wordprocessingml/2006/main" xmlns:w14="http://schemas.microsoft.com/office/word/2010/wordml" xmlns:w15="http://schemas.microsoft.com/office/word/2012/wordml" xmlns:w16cex="http://schemas.microsoft.com/office/word/2018/wordml/cex" xmlns:w16cid="http://schemas.microsoft.com/office/word/2016/wordml/cid" xmlns:w16="http://schemas.microsoft.com/office/word/2018/wordml" xmlns:w16du="http://schemas.microsoft.com/office/word/2023/wordml/word16du" xmlns:w16sdtdh="http://schemas.microsoft.com/office/word/2020/wordml/sdtdatahash" xmlns:w16se="http://schemas.microsoft.com/office/word/2015/wordml/symex" xmlns:wpg="http://schemas.microsoft.com/office/word/2010/wordprocessingGroup" xmlns:wpi="http://schemas.microsoft.com/office/word/2010/wordprocessingInk" xmlns:wne="http://schemas.microsoft.com/office/word/2006/wordml" xmlns:wps="http://schemas.microsoft.com/office/word/2010/wordprocessingShape" mc:Ignorable="w14 w15 w16se w16cid w16 w16cex w16sdtdh wp14">
   <w:abstractNum w:abstractNumId="0" w15:restartNumberingAfterBreak="0">
     <w:nsid w:val="FFFFFF7C"/>
     <w:multiLevelType w:val="singleLevel"/>
@@ -26540,7 +26530,7 @@
 </file>
 
 <file path=word/glossary/document.xml><?xml version="1.0" encoding="utf-8"?>
-<w:glossaryDocument xmlns:wpc="http://schemas.microsoft.com/office/word/2010/wordprocessingCanvas" xmlns:cx="http://schemas.microsoft.com/office/drawing/2014/chartex" xmlns:cx1="http://schemas.microsoft.com/office/drawing/2015/9/8/chartex" xmlns:cx2="http://schemas.microsoft.com/office/drawing/2015/10/21/chartex" xmlns:cx3="http://schemas.microsoft.com/office/drawing/2016/5/9/chartex" xmlns:cx4="http://schemas.microsoft.com/office/drawing/2016/5/10/chartex" xmlns:cx5="http://schemas.microsoft.com/office/drawing/2016/5/11/chartex" xmlns:cx6="http://schemas.microsoft.com/office/drawing/2016/5/12/chartex" xmlns:cx7="http://schemas.microsoft.com/office/drawing/2016/5/13/chartex" xmlns:cx8="http://schemas.microsoft.com/office/drawing/2016/5/14/chartex" xmlns:mc="http://schemas.openxmlformats.org/markup-compatibility/2006" xmlns:aink="http://schemas.microsoft.com/office/drawing/2016/ink" xmlns:am3d="http://schemas.microsoft.com/office/drawing/2017/model3d" xmlns:o="urn:schemas-microsoft-com:office:office" xmlns:oel="http://schemas.microsoft.com/office/2019/extlst" xmlns:r="http://schemas.openxmlformats.org/officeDocument/2006/relationships" xmlns:m="http://schemas.openxmlformats.org/officeDocument/2006/math" xmlns:v="urn:schemas-microsoft-com:vml" xmlns:wp14="http://schemas.microsoft.com/office/word/2010/wordprocessingDrawing" xmlns:wp="http://schemas.openxmlformats.org/drawingml/2006/wordprocessingDrawing" xmlns:w10="urn:schemas-microsoft-com:office:word" xmlns:w="http://schemas.openxmlformats.org/wordprocessingml/2006/main" xmlns:w14="http://schemas.microsoft.com/office/word/2010/wordml" xmlns:w15="http://schemas.microsoft.com/office/word/2012/wordml" xmlns:w16cex="http://schemas.microsoft.com/office/word/2018/wordml/cex" xmlns:w16cid="http://schemas.microsoft.com/office/word/2016/wordml/cid" xmlns:w16="http://schemas.microsoft.com/office/word/2018/wordml" xmlns:w16sdtdh="http://schemas.microsoft.com/office/word/2020/wordml/sdtdatahash" xmlns:w16se="http://schemas.microsoft.com/office/word/2015/wordml/symex" xmlns:wpg="http://schemas.microsoft.com/office/word/2010/wordprocessingGroup" xmlns:wpi="http://schemas.microsoft.com/office/word/2010/wordprocessingInk" xmlns:wne="http://schemas.microsoft.com/office/word/2006/wordml" xmlns:wps="http://schemas.microsoft.com/office/word/2010/wordprocessingShape" mc:Ignorable="w14 w15 w16se w16cid w16 w16cex w16sdtdh wp14">
+<w:glossaryDocument xmlns:wpc="http://schemas.microsoft.com/office/word/2010/wordprocessingCanvas" xmlns:cx="http://schemas.microsoft.com/office/drawing/2014/chartex" xmlns:cx1="http://schemas.microsoft.com/office/drawing/2015/9/8/chartex" xmlns:cx2="http://schemas.microsoft.com/office/drawing/2015/10/21/chartex" xmlns:cx3="http://schemas.microsoft.com/office/drawing/2016/5/9/chartex" xmlns:cx4="http://schemas.microsoft.com/office/drawing/2016/5/10/chartex" xmlns:cx5="http://schemas.microsoft.com/office/drawing/2016/5/11/chartex" xmlns:cx6="http://schemas.microsoft.com/office/drawing/2016/5/12/chartex" xmlns:cx7="http://schemas.microsoft.com/office/drawing/2016/5/13/chartex" xmlns:cx8="http://schemas.microsoft.com/office/drawing/2016/5/14/chartex" xmlns:mc="http://schemas.openxmlformats.org/markup-compatibility/2006" xmlns:aink="http://schemas.microsoft.com/office/drawing/2016/ink" xmlns:am3d="http://schemas.microsoft.com/office/drawing/2017/model3d" xmlns:o="urn:schemas-microsoft-com:office:office" xmlns:oel="http://schemas.microsoft.com/office/2019/extlst" xmlns:r="http://schemas.openxmlformats.org/officeDocument/2006/relationships" xmlns:m="http://schemas.openxmlformats.org/officeDocument/2006/math" xmlns:v="urn:schemas-microsoft-com:vml" xmlns:wp14="http://schemas.microsoft.com/office/word/2010/wordprocessingDrawing" xmlns:wp="http://schemas.openxmlformats.org/drawingml/2006/wordprocessingDrawing" xmlns:w10="urn:schemas-microsoft-com:office:word" xmlns:w="http://schemas.openxmlformats.org/wordprocessingml/2006/main" xmlns:w14="http://schemas.microsoft.com/office/word/2010/wordml" xmlns:w15="http://schemas.microsoft.com/office/word/2012/wordml" xmlns:w16cex="http://schemas.microsoft.com/office/word/2018/wordml/cex" xmlns:w16cid="http://schemas.microsoft.com/office/word/2016/wordml/cid" xmlns:w16="http://schemas.microsoft.com/office/word/2018/wordml" xmlns:w16du="http://schemas.microsoft.com/office/word/2023/wordml/word16du" xmlns:w16sdtdh="http://schemas.microsoft.com/office/word/2020/wordml/sdtdatahash" xmlns:w16se="http://schemas.microsoft.com/office/word/2015/wordml/symex" xmlns:wpg="http://schemas.microsoft.com/office/word/2010/wordprocessingGroup" xmlns:wpi="http://schemas.microsoft.com/office/word/2010/wordprocessingInk" xmlns:wne="http://schemas.microsoft.com/office/word/2006/wordml" xmlns:wps="http://schemas.microsoft.com/office/word/2010/wordprocessingShape" mc:Ignorable="w14 w15 w16se w16cid w16 w16cex w16sdtdh wp14">
   <w:docParts>
     <w:docPart>
       <w:docPartPr>
@@ -26803,6 +26793,7 @@
   </w:compat>
   <w:rsids>
     <w:rsidRoot w:val="008226FC"/>
+    <w:rsid w:val="00262F10"/>
     <w:rsid w:val="003F03E2"/>
     <w:rsid w:val="00565442"/>
     <w:rsid w:val="005B0865"/>
@@ -27267,40 +27258,8 @@
   <w:style w:type="paragraph" w:customStyle="1" w:styleId="E99FD5B3EAC34270BA2AEE29BB8C4FC6">
     <w:name w:val="E99FD5B3EAC34270BA2AEE29BB8C4FC6"/>
   </w:style>
-  <w:style w:type="paragraph" w:customStyle="1" w:styleId="TextLeft">
-    <w:name w:val="TextLeft"/>
-    <w:basedOn w:val="Normal"/>
-    <w:next w:val="Normal"/>
-    <w:uiPriority w:val="4"/>
-    <w:qFormat/>
-    <w:pPr>
-      <w:spacing w:after="0" w:line="288" w:lineRule="auto"/>
-      <w:jc w:val="right"/>
-    </w:pPr>
-    <w:rPr>
-      <w:rFonts w:eastAsiaTheme="minorHAnsi"/>
-      <w:color w:val="404040" w:themeColor="text1" w:themeTint="BF"/>
-      <w:szCs w:val="24"/>
-      <w:lang w:val="en-US" w:eastAsia="en-US"/>
-    </w:rPr>
-  </w:style>
-  <w:style w:type="paragraph" w:customStyle="1" w:styleId="E5AEA0893EAD41C2AEEC115E2E9FA9F2">
-    <w:name w:val="E5AEA0893EAD41C2AEEC115E2E9FA9F2"/>
-  </w:style>
-  <w:style w:type="paragraph" w:customStyle="1" w:styleId="E6E59AD225594FB2B9FD63E661C29D69">
-    <w:name w:val="E6E59AD225594FB2B9FD63E661C29D69"/>
-  </w:style>
-  <w:style w:type="paragraph" w:customStyle="1" w:styleId="F9CBC92E26D14BBB97D6708939F87CB4">
-    <w:name w:val="F9CBC92E26D14BBB97D6708939F87CB4"/>
-  </w:style>
-  <w:style w:type="paragraph" w:customStyle="1" w:styleId="33D4E771827A4C46988D6D84071FD132">
-    <w:name w:val="33D4E771827A4C46988D6D84071FD132"/>
-  </w:style>
   <w:style w:type="paragraph" w:customStyle="1" w:styleId="60F34FF0416A4EE2ABD0143604CB291A">
     <w:name w:val="60F34FF0416A4EE2ABD0143604CB291A"/>
-  </w:style>
-  <w:style w:type="paragraph" w:customStyle="1" w:styleId="6F085C0456264955B3F8297C8A850A9B">
-    <w:name w:val="6F085C0456264955B3F8297C8A850A9B"/>
   </w:style>
   <w:style w:type="paragraph" w:customStyle="1" w:styleId="28D907E540BB458FBF28EF2290D027D5">
     <w:name w:val="28D907E540BB458FBF28EF2290D027D5"/>
@@ -27324,17 +27283,8 @@
   <w:style w:type="paragraph" w:customStyle="1" w:styleId="755A2E71F9274DBEBA704ED3935286C5">
     <w:name w:val="755A2E71F9274DBEBA704ED3935286C5"/>
   </w:style>
-  <w:style w:type="paragraph" w:customStyle="1" w:styleId="DF375EE9A34149368625D7E27174E48C">
-    <w:name w:val="DF375EE9A34149368625D7E27174E48C"/>
-  </w:style>
-  <w:style w:type="paragraph" w:customStyle="1" w:styleId="6FDD913EF2D3409F99EFAAB2DDE948ED">
-    <w:name w:val="6FDD913EF2D3409F99EFAAB2DDE948ED"/>
-  </w:style>
   <w:style w:type="paragraph" w:customStyle="1" w:styleId="4FFDD858F8334537AA8EE67EA128DF15">
     <w:name w:val="4FFDD858F8334537AA8EE67EA128DF15"/>
-  </w:style>
-  <w:style w:type="paragraph" w:customStyle="1" w:styleId="23E7CC9C9F634E93AA133F3AAC525F80">
-    <w:name w:val="23E7CC9C9F634E93AA133F3AAC525F80"/>
   </w:style>
 </w:styles>
 </file>
@@ -27548,12 +27498,11 @@
 </file>
 
 <file path=customXml/item1.xml><?xml version="1.0" encoding="utf-8"?>
-<?mso-contentType ?>
-<FormTemplates xmlns="http://schemas.microsoft.com/sharepoint/v3/contenttype/forms">
-  <Display>DocumentLibraryForm</Display>
-  <Edit>DocumentLibraryForm</Edit>
-  <New>DocumentLibraryForm</New>
-</FormTemplates>
+<p:properties xmlns:p="http://schemas.microsoft.com/office/2006/metadata/properties" xmlns:xsi="http://www.w3.org/2001/XMLSchema-instance" xmlns:pc="http://schemas.microsoft.com/office/infopath/2007/PartnerControls">
+  <documentManagement>
+    <MediaServiceKeyPoints xmlns="71af3243-3dd4-4a8d-8c0d-dd76da1f02a5" xsi:nil="true"/>
+  </documentManagement>
+</p:properties>
 </file>
 
 <file path=customXml/item2.xml><?xml version="1.0" encoding="utf-8"?>
@@ -27768,17 +27717,20 @@
 </file>
 
 <file path=customXml/item3.xml><?xml version="1.0" encoding="utf-8"?>
-<p:properties xmlns:p="http://schemas.microsoft.com/office/2006/metadata/properties" xmlns:xsi="http://www.w3.org/2001/XMLSchema-instance" xmlns:pc="http://schemas.microsoft.com/office/infopath/2007/PartnerControls">
-  <documentManagement>
-    <MediaServiceKeyPoints xmlns="71af3243-3dd4-4a8d-8c0d-dd76da1f02a5" xsi:nil="true"/>
-  </documentManagement>
-</p:properties>
+<?mso-contentType ?>
+<FormTemplates xmlns="http://schemas.microsoft.com/sharepoint/v3/contenttype/forms">
+  <Display>DocumentLibraryForm</Display>
+  <Edit>DocumentLibraryForm</Edit>
+  <New>DocumentLibraryForm</New>
+</FormTemplates>
 </file>
 
 <file path=customXml/itemProps1.xml><?xml version="1.0" encoding="utf-8"?>
-<ds:datastoreItem xmlns:ds="http://schemas.openxmlformats.org/officeDocument/2006/customXml" ds:itemID="{50503A21-F367-462E-B624-BDB4831C4953}">
+<ds:datastoreItem xmlns:ds="http://schemas.openxmlformats.org/officeDocument/2006/customXml" ds:itemID="{24285919-CFDE-4EB8-9796-0DEB1CB8315E}">
   <ds:schemaRefs>
-    <ds:schemaRef ds:uri="http://schemas.microsoft.com/sharepoint/v3/contenttype/forms"/>
+    <ds:schemaRef ds:uri="http://schemas.microsoft.com/office/2006/metadata/properties"/>
+    <ds:schemaRef ds:uri="http://schemas.microsoft.com/office/infopath/2007/PartnerControls"/>
+    <ds:schemaRef ds:uri="71af3243-3dd4-4a8d-8c0d-dd76da1f02a5"/>
   </ds:schemaRefs>
 </ds:datastoreItem>
 </file>
@@ -27803,11 +27755,9 @@
 </file>
 
 <file path=customXml/itemProps3.xml><?xml version="1.0" encoding="utf-8"?>
-<ds:datastoreItem xmlns:ds="http://schemas.openxmlformats.org/officeDocument/2006/customXml" ds:itemID="{24285919-CFDE-4EB8-9796-0DEB1CB8315E}">
+<ds:datastoreItem xmlns:ds="http://schemas.openxmlformats.org/officeDocument/2006/customXml" ds:itemID="{50503A21-F367-462E-B624-BDB4831C4953}">
   <ds:schemaRefs>
-    <ds:schemaRef ds:uri="http://schemas.microsoft.com/office/2006/metadata/properties"/>
-    <ds:schemaRef ds:uri="http://schemas.microsoft.com/office/infopath/2007/PartnerControls"/>
-    <ds:schemaRef ds:uri="71af3243-3dd4-4a8d-8c0d-dd76da1f02a5"/>
+    <ds:schemaRef ds:uri="http://schemas.microsoft.com/sharepoint/v3/contenttype/forms"/>
   </ds:schemaRefs>
 </ds:datastoreItem>
 </file>
</xml_diff>

<commit_message>
Updating starfighter odyssey and adding sleight of hand in progress
</commit_message>
<xml_diff>
--- a/CV/CV.docx
+++ b/CV/CV.docx
@@ -23,8 +23,8 @@
       <w:tblGrid>
         <w:gridCol w:w="890"/>
         <w:gridCol w:w="2672"/>
-        <w:gridCol w:w="3472"/>
-        <w:gridCol w:w="2571"/>
+        <w:gridCol w:w="3471"/>
+        <w:gridCol w:w="2572"/>
         <w:gridCol w:w="861"/>
       </w:tblGrid>
       <w:tr>
@@ -67,7 +67,14 @@
               <w:rPr>
                 <w:rStyle w:val="Emphasis"/>
               </w:rPr>
-              <w:t>Lycia Stenson</w:t>
+              <w:t xml:space="preserve">Lycia </w:t>
+            </w:r>
+            <w:r>
+              <w:rPr>
+                <w:rStyle w:val="Emphasis"/>
+                <w:color w:val="604878"/>
+              </w:rPr>
+              <w:t>Stenson</w:t>
             </w:r>
           </w:p>
           <w:p>
@@ -613,31 +620,13 @@
                 <w:lang w:val="en-GB"/>
               </w:rPr>
             </w:pPr>
-            <w:sdt>
-              <w:sdtPr>
-                <w:rPr>
-                  <w:noProof/>
-                  <w:lang w:val="en-GB"/>
-                </w:rPr>
-                <w:id w:val="-242716918"/>
-                <w:placeholder>
-                  <w:docPart w:val="60F34FF0416A4EE2ABD0143604CB291A"/>
-                </w:placeholder>
-                <w:temporary/>
-                <w:showingPlcHdr/>
-                <w15:appearance w15:val="hidden"/>
-                <w:text/>
-              </w:sdtPr>
-              <w:sdtContent>
-                <w:r>
-                  <w:rPr>
-                    <w:noProof/>
-                    <w:lang w:val="en-GB" w:bidi="en-GB"/>
-                  </w:rPr>
-                  <w:t>Key skills</w:t>
-                </w:r>
-              </w:sdtContent>
-            </w:sdt>
+            <w:r>
+              <w:rPr>
+                <w:noProof/>
+                <w:lang w:val="en-GB"/>
+              </w:rPr>
+              <w:t>Additional Skills</w:t>
+            </w:r>
           </w:p>
           <w:p>
             <w:pPr>
@@ -714,91 +703,58 @@
               <w:bottom w:val="single" w:sz="8" w:space="0" w:color="604878" w:themeColor="accent5"/>
             </w:tcBorders>
           </w:tcPr>
-          <w:sdt>
-            <w:sdtPr>
+          <w:p>
+            <w:pPr>
+              <w:pStyle w:val="Heading2"/>
               <w:rPr>
                 <w:noProof/>
                 <w:lang w:val="en-GB"/>
               </w:rPr>
-              <w:id w:val="61914896"/>
-              <w:placeholder>
-                <w:docPart w:val="28D907E540BB458FBF28EF2290D027D5"/>
-              </w:placeholder>
-              <w:temporary/>
-              <w:showingPlcHdr/>
-              <w15:appearance w15:val="hidden"/>
-              <w:text/>
-            </w:sdtPr>
-            <w:sdtContent>
-              <w:p>
-                <w:pPr>
-                  <w:pStyle w:val="Heading2"/>
-                  <w:rPr>
-                    <w:noProof/>
-                    <w:lang w:val="en-GB"/>
-                  </w:rPr>
-                </w:pPr>
-                <w:r>
-                  <w:rPr>
-                    <w:noProof/>
-                    <w:lang w:val="en-GB" w:bidi="en-GB"/>
-                  </w:rPr>
-                  <w:t>Communication</w:t>
-                </w:r>
-              </w:p>
-            </w:sdtContent>
-          </w:sdt>
-          <w:sdt>
-            <w:sdtPr>
+            </w:pPr>
+            <w:r>
               <w:rPr>
                 <w:noProof/>
-                <w:w w:val="105"/>
                 <w:lang w:val="en-GB"/>
               </w:rPr>
-              <w:id w:val="884376286"/>
-              <w:placeholder>
-                <w:docPart w:val="755A2E71F9274DBEBA704ED3935286C5"/>
-              </w:placeholder>
-              <w:temporary/>
-              <w:showingPlcHdr/>
-              <w15:appearance w15:val="hidden"/>
-              <w:text/>
-            </w:sdtPr>
-            <w:sdtContent>
-              <w:p>
-                <w:pPr>
-                  <w:pStyle w:val="TextRight"/>
-                  <w:rPr>
-                    <w:noProof/>
-                    <w:lang w:val="en-GB"/>
-                  </w:rPr>
-                </w:pPr>
-                <w:r>
-                  <w:rPr>
-                    <w:noProof/>
-                    <w:lang w:val="en-GB" w:bidi="en-GB"/>
-                  </w:rPr>
-                  <w:t>[You delivered that big presentation and got great feedback. Don’t be shy about it now!</w:t>
-                </w:r>
-              </w:p>
-              <w:p>
-                <w:pPr>
-                  <w:pStyle w:val="TextRight"/>
-                  <w:rPr>
-                    <w:noProof/>
-                    <w:lang w:val="en-GB"/>
-                  </w:rPr>
-                </w:pPr>
-                <w:r>
-                  <w:rPr>
-                    <w:noProof/>
-                    <w:lang w:val="en-GB" w:bidi="en-GB"/>
-                  </w:rPr>
-                  <w:t>This is the place to show how well you work and play with others.]</w:t>
-                </w:r>
-              </w:p>
-            </w:sdtContent>
-          </w:sdt>
+              <w:t>Employment</w:t>
+            </w:r>
+          </w:p>
+          <w:p>
+            <w:pPr>
+              <w:pStyle w:val="TextRight"/>
+              <w:rPr>
+                <w:noProof/>
+                <w:lang w:val="en-GB"/>
+              </w:rPr>
+            </w:pPr>
+            <w:r>
+              <w:rPr>
+                <w:rFonts w:asciiTheme="minorHAnsi" w:hAnsiTheme="minorHAnsi" w:cstheme="minorBidi"/>
+                <w:color w:val="auto"/>
+                <w:szCs w:val="22"/>
+                <w:lang w:val="en-GB"/>
+              </w:rPr>
+              <w:t>I was invited to work at university open days speaking with prospective students about the university from a student’s perspective. Particularly what the games courses are like, including demoing the equipment available to students.</w:t>
+            </w:r>
+            <w:r>
+              <w:rPr>
+                <w:rFonts w:asciiTheme="minorHAnsi" w:hAnsiTheme="minorHAnsi" w:cstheme="minorBidi"/>
+                <w:color w:val="auto"/>
+                <w:szCs w:val="22"/>
+                <w:lang w:val="en-GB"/>
+              </w:rPr>
+              <w:t xml:space="preserve"> </w:t>
+            </w:r>
+            <w:r>
+              <w:rPr>
+                <w:rFonts w:asciiTheme="minorHAnsi" w:hAnsiTheme="minorHAnsi" w:cstheme="minorBidi"/>
+                <w:color w:val="auto"/>
+                <w:szCs w:val="22"/>
+                <w:lang w:val="en-GB"/>
+              </w:rPr>
+              <w:t>Following this I have now been employed by the university as a Student Ambassador where I perform campus tours and I am looking forward to working with the outreach team at local schools.</w:t>
+            </w:r>
+          </w:p>
           <w:p>
             <w:pPr>
               <w:pStyle w:val="TextRight"/>
@@ -26563,104 +26519,6 @@
     </w:docPart>
     <w:docPart>
       <w:docPartPr>
-        <w:name w:val="60F34FF0416A4EE2ABD0143604CB291A"/>
-        <w:category>
-          <w:name w:val="General"/>
-          <w:gallery w:val="placeholder"/>
-        </w:category>
-        <w:types>
-          <w:type w:val="bbPlcHdr"/>
-        </w:types>
-        <w:behaviors>
-          <w:behavior w:val="content"/>
-        </w:behaviors>
-        <w:guid w:val="{67FB949B-DEEF-4659-9525-3F42770AFE8D}"/>
-      </w:docPartPr>
-      <w:docPartBody>
-        <w:p>
-          <w:pPr>
-            <w:pStyle w:val="60F34FF0416A4EE2ABD0143604CB291A"/>
-          </w:pPr>
-          <w:r>
-            <w:rPr>
-              <w:lang w:bidi="en-GB"/>
-            </w:rPr>
-            <w:t>Key skills</w:t>
-          </w:r>
-        </w:p>
-      </w:docPartBody>
-    </w:docPart>
-    <w:docPart>
-      <w:docPartPr>
-        <w:name w:val="28D907E540BB458FBF28EF2290D027D5"/>
-        <w:category>
-          <w:name w:val="General"/>
-          <w:gallery w:val="placeholder"/>
-        </w:category>
-        <w:types>
-          <w:type w:val="bbPlcHdr"/>
-        </w:types>
-        <w:behaviors>
-          <w:behavior w:val="content"/>
-        </w:behaviors>
-        <w:guid w:val="{2E241164-55B6-4A95-944D-7745CE7B1415}"/>
-      </w:docPartPr>
-      <w:docPartBody>
-        <w:p>
-          <w:pPr>
-            <w:pStyle w:val="28D907E540BB458FBF28EF2290D027D5"/>
-          </w:pPr>
-          <w:r>
-            <w:rPr>
-              <w:lang w:bidi="en-GB"/>
-            </w:rPr>
-            <w:t>Communication</w:t>
-          </w:r>
-        </w:p>
-      </w:docPartBody>
-    </w:docPart>
-    <w:docPart>
-      <w:docPartPr>
-        <w:name w:val="755A2E71F9274DBEBA704ED3935286C5"/>
-        <w:category>
-          <w:name w:val="General"/>
-          <w:gallery w:val="placeholder"/>
-        </w:category>
-        <w:types>
-          <w:type w:val="bbPlcHdr"/>
-        </w:types>
-        <w:behaviors>
-          <w:behavior w:val="content"/>
-        </w:behaviors>
-        <w:guid w:val="{C5F47422-DEBF-4A40-B4A9-6E0A7358DA95}"/>
-      </w:docPartPr>
-      <w:docPartBody>
-        <w:p>
-          <w:pPr>
-            <w:pStyle w:val="TextRight"/>
-          </w:pPr>
-          <w:r>
-            <w:rPr>
-              <w:lang w:val="en-GB" w:bidi="en-GB"/>
-            </w:rPr>
-            <w:t>[You delivered that big presentation to rave reviews. Don’t be shy about it now!</w:t>
-          </w:r>
-        </w:p>
-        <w:p>
-          <w:pPr>
-            <w:pStyle w:val="755A2E71F9274DBEBA704ED3935286C5"/>
-          </w:pPr>
-          <w:r>
-            <w:rPr>
-              <w:lang w:bidi="en-GB"/>
-            </w:rPr>
-            <w:t>This is the place to show how well you work and play with others.]</w:t>
-          </w:r>
-        </w:p>
-      </w:docPartBody>
-    </w:docPart>
-    <w:docPart>
-      <w:docPartPr>
         <w:name w:val="4FFDD858F8334537AA8EE67EA128DF15"/>
         <w:category>
           <w:name w:val="General"/>
@@ -26751,7 +26609,7 @@
     <w:charset w:val="86"/>
     <w:family w:val="auto"/>
     <w:pitch w:val="variable"/>
-    <w:sig w:usb0="00000003" w:usb1="288F0000" w:usb2="00000016" w:usb3="00000000" w:csb0="00040001" w:csb1="00000000"/>
+    <w:sig w:usb0="00000203" w:usb1="288F0000" w:usb2="00000016" w:usb3="00000000" w:csb0="00040001" w:csb1="00000000"/>
   </w:font>
   <w:font w:name="Consolas">
     <w:panose1 w:val="020B0609020204030204"/>
@@ -26799,6 +26657,7 @@
     <w:rsid w:val="005B0865"/>
     <w:rsid w:val="006107C4"/>
     <w:rsid w:val="008226FC"/>
+    <w:rsid w:val="00AF17B0"/>
   </w:rsids>
   <m:mathPr>
     <m:mathFont m:val="Cambria Math"/>
@@ -27498,11 +27357,12 @@
 </file>
 
 <file path=customXml/item1.xml><?xml version="1.0" encoding="utf-8"?>
-<p:properties xmlns:p="http://schemas.microsoft.com/office/2006/metadata/properties" xmlns:xsi="http://www.w3.org/2001/XMLSchema-instance" xmlns:pc="http://schemas.microsoft.com/office/infopath/2007/PartnerControls">
-  <documentManagement>
-    <MediaServiceKeyPoints xmlns="71af3243-3dd4-4a8d-8c0d-dd76da1f02a5" xsi:nil="true"/>
-  </documentManagement>
-</p:properties>
+<?mso-contentType ?>
+<FormTemplates xmlns="http://schemas.microsoft.com/sharepoint/v3/contenttype/forms">
+  <Display>DocumentLibraryForm</Display>
+  <Edit>DocumentLibraryForm</Edit>
+  <New>DocumentLibraryForm</New>
+</FormTemplates>
 </file>
 
 <file path=customXml/item2.xml><?xml version="1.0" encoding="utf-8"?>
@@ -27717,20 +27577,17 @@
 </file>
 
 <file path=customXml/item3.xml><?xml version="1.0" encoding="utf-8"?>
-<?mso-contentType ?>
-<FormTemplates xmlns="http://schemas.microsoft.com/sharepoint/v3/contenttype/forms">
-  <Display>DocumentLibraryForm</Display>
-  <Edit>DocumentLibraryForm</Edit>
-  <New>DocumentLibraryForm</New>
-</FormTemplates>
+<p:properties xmlns:p="http://schemas.microsoft.com/office/2006/metadata/properties" xmlns:xsi="http://www.w3.org/2001/XMLSchema-instance" xmlns:pc="http://schemas.microsoft.com/office/infopath/2007/PartnerControls">
+  <documentManagement>
+    <MediaServiceKeyPoints xmlns="71af3243-3dd4-4a8d-8c0d-dd76da1f02a5" xsi:nil="true"/>
+  </documentManagement>
+</p:properties>
 </file>
 
 <file path=customXml/itemProps1.xml><?xml version="1.0" encoding="utf-8"?>
-<ds:datastoreItem xmlns:ds="http://schemas.openxmlformats.org/officeDocument/2006/customXml" ds:itemID="{24285919-CFDE-4EB8-9796-0DEB1CB8315E}">
+<ds:datastoreItem xmlns:ds="http://schemas.openxmlformats.org/officeDocument/2006/customXml" ds:itemID="{50503A21-F367-462E-B624-BDB4831C4953}">
   <ds:schemaRefs>
-    <ds:schemaRef ds:uri="http://schemas.microsoft.com/office/2006/metadata/properties"/>
-    <ds:schemaRef ds:uri="http://schemas.microsoft.com/office/infopath/2007/PartnerControls"/>
-    <ds:schemaRef ds:uri="71af3243-3dd4-4a8d-8c0d-dd76da1f02a5"/>
+    <ds:schemaRef ds:uri="http://schemas.microsoft.com/sharepoint/v3/contenttype/forms"/>
   </ds:schemaRefs>
 </ds:datastoreItem>
 </file>
@@ -27755,9 +27612,11 @@
 </file>
 
 <file path=customXml/itemProps3.xml><?xml version="1.0" encoding="utf-8"?>
-<ds:datastoreItem xmlns:ds="http://schemas.openxmlformats.org/officeDocument/2006/customXml" ds:itemID="{50503A21-F367-462E-B624-BDB4831C4953}">
+<ds:datastoreItem xmlns:ds="http://schemas.openxmlformats.org/officeDocument/2006/customXml" ds:itemID="{24285919-CFDE-4EB8-9796-0DEB1CB8315E}">
   <ds:schemaRefs>
-    <ds:schemaRef ds:uri="http://schemas.microsoft.com/sharepoint/v3/contenttype/forms"/>
+    <ds:schemaRef ds:uri="http://schemas.microsoft.com/office/2006/metadata/properties"/>
+    <ds:schemaRef ds:uri="http://schemas.microsoft.com/office/infopath/2007/PartnerControls"/>
+    <ds:schemaRef ds:uri="71af3243-3dd4-4a8d-8c0d-dd76da1f02a5"/>
   </ds:schemaRefs>
 </ds:datastoreItem>
 </file>
</xml_diff>

<commit_message>
Added mobbers work to CV
</commit_message>
<xml_diff>
--- a/CV/CV.docx
+++ b/CV/CV.docx
@@ -1,6 +1,6 @@
 
 <file path=word/document.xml><?xml version="1.0" encoding="utf-8"?>
-<w:document xmlns:wpc="http://schemas.microsoft.com/office/word/2010/wordprocessingCanvas" xmlns:cx="http://schemas.microsoft.com/office/drawing/2014/chartex" xmlns:cx1="http://schemas.microsoft.com/office/drawing/2015/9/8/chartex" xmlns:cx2="http://schemas.microsoft.com/office/drawing/2015/10/21/chartex" xmlns:cx3="http://schemas.microsoft.com/office/drawing/2016/5/9/chartex" xmlns:cx4="http://schemas.microsoft.com/office/drawing/2016/5/10/chartex" xmlns:cx5="http://schemas.microsoft.com/office/drawing/2016/5/11/chartex" xmlns:cx6="http://schemas.microsoft.com/office/drawing/2016/5/12/chartex" xmlns:cx7="http://schemas.microsoft.com/office/drawing/2016/5/13/chartex" xmlns:cx8="http://schemas.microsoft.com/office/drawing/2016/5/14/chartex" xmlns:mc="http://schemas.openxmlformats.org/markup-compatibility/2006" xmlns:aink="http://schemas.microsoft.com/office/drawing/2016/ink" xmlns:am3d="http://schemas.microsoft.com/office/drawing/2017/model3d" xmlns:o="urn:schemas-microsoft-com:office:office" xmlns:oel="http://schemas.microsoft.com/office/2019/extlst" xmlns:r="http://schemas.openxmlformats.org/officeDocument/2006/relationships" xmlns:m="http://schemas.openxmlformats.org/officeDocument/2006/math" xmlns:v="urn:schemas-microsoft-com:vml" xmlns:wp14="http://schemas.microsoft.com/office/word/2010/wordprocessingDrawing" xmlns:wp="http://schemas.openxmlformats.org/drawingml/2006/wordprocessingDrawing" xmlns:w10="urn:schemas-microsoft-com:office:word" xmlns:w="http://schemas.openxmlformats.org/wordprocessingml/2006/main" xmlns:w14="http://schemas.microsoft.com/office/word/2010/wordml" xmlns:w15="http://schemas.microsoft.com/office/word/2012/wordml" xmlns:w16cex="http://schemas.microsoft.com/office/word/2018/wordml/cex" xmlns:w16cid="http://schemas.microsoft.com/office/word/2016/wordml/cid" xmlns:w16="http://schemas.microsoft.com/office/word/2018/wordml" xmlns:w16du="http://schemas.microsoft.com/office/word/2023/wordml/word16du" xmlns:w16sdtdh="http://schemas.microsoft.com/office/word/2020/wordml/sdtdatahash" xmlns:w16se="http://schemas.microsoft.com/office/word/2015/wordml/symex" xmlns:wpg="http://schemas.microsoft.com/office/word/2010/wordprocessingGroup" xmlns:wpi="http://schemas.microsoft.com/office/word/2010/wordprocessingInk" xmlns:wne="http://schemas.microsoft.com/office/word/2006/wordml" xmlns:wps="http://schemas.microsoft.com/office/word/2010/wordprocessingShape" mc:Ignorable="w14 w15 w16se w16cid w16 w16cex w16sdtdh wp14">
+<w:document xmlns:wpc="http://schemas.microsoft.com/office/word/2010/wordprocessingCanvas" xmlns:cx="http://schemas.microsoft.com/office/drawing/2014/chartex" xmlns:cx1="http://schemas.microsoft.com/office/drawing/2015/9/8/chartex" xmlns:cx2="http://schemas.microsoft.com/office/drawing/2015/10/21/chartex" xmlns:cx3="http://schemas.microsoft.com/office/drawing/2016/5/9/chartex" xmlns:cx4="http://schemas.microsoft.com/office/drawing/2016/5/10/chartex" xmlns:cx5="http://schemas.microsoft.com/office/drawing/2016/5/11/chartex" xmlns:cx6="http://schemas.microsoft.com/office/drawing/2016/5/12/chartex" xmlns:cx7="http://schemas.microsoft.com/office/drawing/2016/5/13/chartex" xmlns:cx8="http://schemas.microsoft.com/office/drawing/2016/5/14/chartex" xmlns:mc="http://schemas.openxmlformats.org/markup-compatibility/2006" xmlns:aink="http://schemas.microsoft.com/office/drawing/2016/ink" xmlns:am3d="http://schemas.microsoft.com/office/drawing/2017/model3d" xmlns:o="urn:schemas-microsoft-com:office:office" xmlns:oel="http://schemas.microsoft.com/office/2019/extlst" xmlns:r="http://schemas.openxmlformats.org/officeDocument/2006/relationships" xmlns:m="http://schemas.openxmlformats.org/officeDocument/2006/math" xmlns:v="urn:schemas-microsoft-com:vml" xmlns:wp14="http://schemas.microsoft.com/office/word/2010/wordprocessingDrawing" xmlns:wp="http://schemas.openxmlformats.org/drawingml/2006/wordprocessingDrawing" xmlns:w10="urn:schemas-microsoft-com:office:word" xmlns:w="http://schemas.openxmlformats.org/wordprocessingml/2006/main" xmlns:w14="http://schemas.microsoft.com/office/word/2010/wordml" xmlns:w15="http://schemas.microsoft.com/office/word/2012/wordml" xmlns:w16cex="http://schemas.microsoft.com/office/word/2018/wordml/cex" xmlns:w16cid="http://schemas.microsoft.com/office/word/2016/wordml/cid" xmlns:w16="http://schemas.microsoft.com/office/word/2018/wordml" xmlns:w16sdtdh="http://schemas.microsoft.com/office/word/2020/wordml/sdtdatahash" xmlns:w16se="http://schemas.microsoft.com/office/word/2015/wordml/symex" xmlns:wpg="http://schemas.microsoft.com/office/word/2010/wordprocessingGroup" xmlns:wpi="http://schemas.microsoft.com/office/word/2010/wordprocessingInk" xmlns:wne="http://schemas.microsoft.com/office/word/2006/wordml" xmlns:wps="http://schemas.microsoft.com/office/word/2010/wordprocessingShape" mc:Ignorable="w14 w15 w16se w16cid w16 w16cex w16sdtdh wp14">
   <w:body>
     <w:tbl>
       <w:tblPr>
@@ -723,7 +723,9 @@
             <w:pPr>
               <w:pStyle w:val="TextRight"/>
               <w:rPr>
-                <w:noProof/>
+                <w:rFonts w:asciiTheme="minorHAnsi" w:hAnsiTheme="minorHAnsi" w:cstheme="minorBidi"/>
+                <w:color w:val="auto"/>
+                <w:szCs w:val="22"/>
                 <w:lang w:val="en-GB"/>
               </w:rPr>
             </w:pPr>
@@ -752,17 +754,208 @@
                 <w:szCs w:val="22"/>
                 <w:lang w:val="en-GB"/>
               </w:rPr>
-              <w:t>Following this I have now been employed by the university as a Student Ambassador where I perform campus tours and I am looking forward to working with the outreach team at local schools.</w:t>
+              <w:t>Following this I have now been employed by the university as a Student Ambassador</w:t>
+            </w:r>
+            <w:r>
+              <w:rPr>
+                <w:rFonts w:asciiTheme="minorHAnsi" w:hAnsiTheme="minorHAnsi" w:cstheme="minorBidi"/>
+                <w:color w:val="auto"/>
+                <w:szCs w:val="22"/>
+                <w:lang w:val="en-GB"/>
+              </w:rPr>
+              <w:t>.</w:t>
             </w:r>
           </w:p>
           <w:p>
             <w:pPr>
-              <w:pStyle w:val="TextRight"/>
               <w:rPr>
-                <w:noProof/>
+                <w:rFonts w:asciiTheme="minorHAnsi" w:hAnsiTheme="minorHAnsi" w:cstheme="minorBidi"/>
+                <w:color w:val="auto"/>
+                <w:sz w:val="22"/>
+                <w:szCs w:val="22"/>
                 <w:lang w:val="en-GB"/>
               </w:rPr>
             </w:pPr>
+            <w:r>
+              <w:rPr>
+                <w:rFonts w:asciiTheme="minorHAnsi" w:hAnsiTheme="minorHAnsi" w:cstheme="minorBidi"/>
+                <w:color w:val="auto"/>
+                <w:sz w:val="22"/>
+                <w:szCs w:val="22"/>
+                <w:lang w:val="en-GB"/>
+              </w:rPr>
+              <w:t>As part of</w:t>
+            </w:r>
+            <w:r>
+              <w:rPr>
+                <w:rFonts w:asciiTheme="minorHAnsi" w:hAnsiTheme="minorHAnsi" w:cstheme="minorBidi"/>
+                <w:color w:val="auto"/>
+                <w:sz w:val="22"/>
+                <w:szCs w:val="22"/>
+                <w:lang w:val="en-GB"/>
+              </w:rPr>
+              <w:t xml:space="preserve"> </w:t>
+            </w:r>
+            <w:r>
+              <w:rPr>
+                <w:rFonts w:asciiTheme="minorHAnsi" w:hAnsiTheme="minorHAnsi" w:cstheme="minorBidi"/>
+                <w:color w:val="auto"/>
+                <w:sz w:val="22"/>
+                <w:szCs w:val="22"/>
+                <w:lang w:val="en-GB"/>
+              </w:rPr>
+              <w:t>my course’s</w:t>
+            </w:r>
+            <w:r>
+              <w:rPr>
+                <w:rFonts w:asciiTheme="minorHAnsi" w:hAnsiTheme="minorHAnsi" w:cstheme="minorBidi"/>
+                <w:color w:val="auto"/>
+                <w:sz w:val="22"/>
+                <w:szCs w:val="22"/>
+                <w:lang w:val="en-GB"/>
+              </w:rPr>
+              <w:t xml:space="preserve"> Professional Awareness </w:t>
+            </w:r>
+            <w:r>
+              <w:rPr>
+                <w:rFonts w:asciiTheme="minorHAnsi" w:hAnsiTheme="minorHAnsi" w:cstheme="minorBidi"/>
+                <w:color w:val="auto"/>
+                <w:sz w:val="22"/>
+                <w:szCs w:val="22"/>
+                <w:lang w:val="en-GB"/>
+              </w:rPr>
+              <w:t>module,</w:t>
+            </w:r>
+            <w:r>
+              <w:rPr>
+                <w:rFonts w:asciiTheme="minorHAnsi" w:hAnsiTheme="minorHAnsi" w:cstheme="minorBidi"/>
+                <w:color w:val="auto"/>
+                <w:sz w:val="22"/>
+                <w:szCs w:val="22"/>
+                <w:lang w:val="en-GB"/>
+              </w:rPr>
+              <w:t xml:space="preserve"> I </w:t>
+            </w:r>
+            <w:r>
+              <w:rPr>
+                <w:rFonts w:asciiTheme="minorHAnsi" w:hAnsiTheme="minorHAnsi" w:cstheme="minorBidi"/>
+                <w:color w:val="auto"/>
+                <w:sz w:val="22"/>
+                <w:szCs w:val="22"/>
+                <w:lang w:val="en-GB"/>
+              </w:rPr>
+              <w:t>collaborated</w:t>
+            </w:r>
+            <w:r>
+              <w:rPr>
+                <w:rFonts w:asciiTheme="minorHAnsi" w:hAnsiTheme="minorHAnsi" w:cstheme="minorBidi"/>
+                <w:color w:val="auto"/>
+                <w:sz w:val="22"/>
+                <w:szCs w:val="22"/>
+                <w:lang w:val="en-GB"/>
+              </w:rPr>
+              <w:t xml:space="preserve"> with the </w:t>
+            </w:r>
+            <w:r>
+              <w:rPr>
+                <w:rFonts w:asciiTheme="minorHAnsi" w:hAnsiTheme="minorHAnsi" w:cstheme="minorBidi"/>
+                <w:color w:val="auto"/>
+                <w:sz w:val="22"/>
+                <w:szCs w:val="22"/>
+                <w:lang w:val="en-GB"/>
+              </w:rPr>
+              <w:t>M</w:t>
+            </w:r>
+            <w:r>
+              <w:rPr>
+                <w:rFonts w:asciiTheme="minorHAnsi" w:hAnsiTheme="minorHAnsi" w:cstheme="minorBidi"/>
+                <w:color w:val="auto"/>
+                <w:sz w:val="22"/>
+                <w:szCs w:val="22"/>
+                <w:lang w:val="en-GB"/>
+              </w:rPr>
+              <w:t>Sc</w:t>
+            </w:r>
+            <w:r>
+              <w:rPr>
+                <w:rFonts w:asciiTheme="minorHAnsi" w:hAnsiTheme="minorHAnsi" w:cstheme="minorBidi"/>
+                <w:color w:val="auto"/>
+                <w:sz w:val="22"/>
+                <w:szCs w:val="22"/>
+                <w:lang w:val="en-GB"/>
+              </w:rPr>
+              <w:t xml:space="preserve"> group Septagram Games on their game Mobbers</w:t>
+            </w:r>
+            <w:r>
+              <w:rPr>
+                <w:rFonts w:asciiTheme="minorHAnsi" w:hAnsiTheme="minorHAnsi" w:cstheme="minorBidi"/>
+                <w:color w:val="auto"/>
+                <w:sz w:val="22"/>
+                <w:szCs w:val="22"/>
+                <w:lang w:val="en-GB"/>
+              </w:rPr>
+              <w:t>. This experience</w:t>
+            </w:r>
+            <w:r>
+              <w:rPr>
+                <w:rFonts w:asciiTheme="minorHAnsi" w:hAnsiTheme="minorHAnsi" w:cstheme="minorBidi"/>
+                <w:color w:val="auto"/>
+                <w:sz w:val="22"/>
+                <w:szCs w:val="22"/>
+                <w:lang w:val="en-GB"/>
+              </w:rPr>
+              <w:t xml:space="preserve"> </w:t>
+            </w:r>
+            <w:r>
+              <w:rPr>
+                <w:rFonts w:asciiTheme="minorHAnsi" w:hAnsiTheme="minorHAnsi" w:cstheme="minorBidi"/>
+                <w:color w:val="auto"/>
+                <w:sz w:val="22"/>
+                <w:szCs w:val="22"/>
+                <w:lang w:val="en-GB"/>
+              </w:rPr>
+              <w:t>provided valuable insight</w:t>
+            </w:r>
+            <w:r>
+              <w:rPr>
+                <w:rFonts w:asciiTheme="minorHAnsi" w:hAnsiTheme="minorHAnsi" w:cstheme="minorBidi"/>
+                <w:color w:val="auto"/>
+                <w:sz w:val="22"/>
+                <w:szCs w:val="22"/>
+                <w:lang w:val="en-GB"/>
+              </w:rPr>
+              <w:t xml:space="preserve"> </w:t>
+            </w:r>
+            <w:r>
+              <w:rPr>
+                <w:rFonts w:asciiTheme="minorHAnsi" w:hAnsiTheme="minorHAnsi" w:cstheme="minorBidi"/>
+                <w:color w:val="auto"/>
+                <w:sz w:val="22"/>
+                <w:szCs w:val="22"/>
+                <w:lang w:val="en-GB"/>
+              </w:rPr>
+              <w:t>in</w:t>
+            </w:r>
+            <w:r>
+              <w:rPr>
+                <w:rFonts w:asciiTheme="minorHAnsi" w:hAnsiTheme="minorHAnsi" w:cstheme="minorBidi"/>
+                <w:color w:val="auto"/>
+                <w:sz w:val="22"/>
+                <w:szCs w:val="22"/>
+                <w:lang w:val="en-GB"/>
+              </w:rPr>
+              <w:t>to</w:t>
+            </w:r>
+            <w:r>
+              <w:rPr>
+                <w:rFonts w:asciiTheme="minorHAnsi" w:hAnsiTheme="minorHAnsi" w:cstheme="minorBidi"/>
+                <w:color w:val="auto"/>
+                <w:sz w:val="22"/>
+                <w:szCs w:val="22"/>
+                <w:lang w:val="en-GB"/>
+              </w:rPr>
+              <w:t xml:space="preserve"> working in small development teams.</w:t>
+            </w:r>
           </w:p>
         </w:tc>
       </w:tr>
@@ -983,7 +1176,7 @@
 </file>
 
 <file path=word/endnotes.xml><?xml version="1.0" encoding="utf-8"?>
-<w:endnotes xmlns:wpc="http://schemas.microsoft.com/office/word/2010/wordprocessingCanvas" xmlns:cx="http://schemas.microsoft.com/office/drawing/2014/chartex" xmlns:cx1="http://schemas.microsoft.com/office/drawing/2015/9/8/chartex" xmlns:cx2="http://schemas.microsoft.com/office/drawing/2015/10/21/chartex" xmlns:cx3="http://schemas.microsoft.com/office/drawing/2016/5/9/chartex" xmlns:cx4="http://schemas.microsoft.com/office/drawing/2016/5/10/chartex" xmlns:cx5="http://schemas.microsoft.com/office/drawing/2016/5/11/chartex" xmlns:cx6="http://schemas.microsoft.com/office/drawing/2016/5/12/chartex" xmlns:cx7="http://schemas.microsoft.com/office/drawing/2016/5/13/chartex" xmlns:cx8="http://schemas.microsoft.com/office/drawing/2016/5/14/chartex" xmlns:mc="http://schemas.openxmlformats.org/markup-compatibility/2006" xmlns:aink="http://schemas.microsoft.com/office/drawing/2016/ink" xmlns:am3d="http://schemas.microsoft.com/office/drawing/2017/model3d" xmlns:o="urn:schemas-microsoft-com:office:office" xmlns:oel="http://schemas.microsoft.com/office/2019/extlst" xmlns:r="http://schemas.openxmlformats.org/officeDocument/2006/relationships" xmlns:m="http://schemas.openxmlformats.org/officeDocument/2006/math" xmlns:v="urn:schemas-microsoft-com:vml" xmlns:wp14="http://schemas.microsoft.com/office/word/2010/wordprocessingDrawing" xmlns:wp="http://schemas.openxmlformats.org/drawingml/2006/wordprocessingDrawing" xmlns:w10="urn:schemas-microsoft-com:office:word" xmlns:w="http://schemas.openxmlformats.org/wordprocessingml/2006/main" xmlns:w14="http://schemas.microsoft.com/office/word/2010/wordml" xmlns:w15="http://schemas.microsoft.com/office/word/2012/wordml" xmlns:w16cex="http://schemas.microsoft.com/office/word/2018/wordml/cex" xmlns:w16cid="http://schemas.microsoft.com/office/word/2016/wordml/cid" xmlns:w16="http://schemas.microsoft.com/office/word/2018/wordml" xmlns:w16du="http://schemas.microsoft.com/office/word/2023/wordml/word16du" xmlns:w16sdtdh="http://schemas.microsoft.com/office/word/2020/wordml/sdtdatahash" xmlns:w16se="http://schemas.microsoft.com/office/word/2015/wordml/symex" xmlns:wpg="http://schemas.microsoft.com/office/word/2010/wordprocessingGroup" xmlns:wpi="http://schemas.microsoft.com/office/word/2010/wordprocessingInk" xmlns:wne="http://schemas.microsoft.com/office/word/2006/wordml" xmlns:wps="http://schemas.microsoft.com/office/word/2010/wordprocessingShape" mc:Ignorable="w14 w15 w16se w16cid w16 w16cex w16sdtdh wp14">
+<w:endnotes xmlns:wpc="http://schemas.microsoft.com/office/word/2010/wordprocessingCanvas" xmlns:cx="http://schemas.microsoft.com/office/drawing/2014/chartex" xmlns:cx1="http://schemas.microsoft.com/office/drawing/2015/9/8/chartex" xmlns:cx2="http://schemas.microsoft.com/office/drawing/2015/10/21/chartex" xmlns:cx3="http://schemas.microsoft.com/office/drawing/2016/5/9/chartex" xmlns:cx4="http://schemas.microsoft.com/office/drawing/2016/5/10/chartex" xmlns:cx5="http://schemas.microsoft.com/office/drawing/2016/5/11/chartex" xmlns:cx6="http://schemas.microsoft.com/office/drawing/2016/5/12/chartex" xmlns:cx7="http://schemas.microsoft.com/office/drawing/2016/5/13/chartex" xmlns:cx8="http://schemas.microsoft.com/office/drawing/2016/5/14/chartex" xmlns:mc="http://schemas.openxmlformats.org/markup-compatibility/2006" xmlns:aink="http://schemas.microsoft.com/office/drawing/2016/ink" xmlns:am3d="http://schemas.microsoft.com/office/drawing/2017/model3d" xmlns:o="urn:schemas-microsoft-com:office:office" xmlns:oel="http://schemas.microsoft.com/office/2019/extlst" xmlns:r="http://schemas.openxmlformats.org/officeDocument/2006/relationships" xmlns:m="http://schemas.openxmlformats.org/officeDocument/2006/math" xmlns:v="urn:schemas-microsoft-com:vml" xmlns:wp14="http://schemas.microsoft.com/office/word/2010/wordprocessingDrawing" xmlns:wp="http://schemas.openxmlformats.org/drawingml/2006/wordprocessingDrawing" xmlns:w10="urn:schemas-microsoft-com:office:word" xmlns:w="http://schemas.openxmlformats.org/wordprocessingml/2006/main" xmlns:w14="http://schemas.microsoft.com/office/word/2010/wordml" xmlns:w15="http://schemas.microsoft.com/office/word/2012/wordml" xmlns:w16cex="http://schemas.microsoft.com/office/word/2018/wordml/cex" xmlns:w16cid="http://schemas.microsoft.com/office/word/2016/wordml/cid" xmlns:w16="http://schemas.microsoft.com/office/word/2018/wordml" xmlns:w16sdtdh="http://schemas.microsoft.com/office/word/2020/wordml/sdtdatahash" xmlns:w16se="http://schemas.microsoft.com/office/word/2015/wordml/symex" xmlns:wpg="http://schemas.microsoft.com/office/word/2010/wordprocessingGroup" xmlns:wpi="http://schemas.microsoft.com/office/word/2010/wordprocessingInk" xmlns:wne="http://schemas.microsoft.com/office/word/2006/wordml" xmlns:wps="http://schemas.microsoft.com/office/word/2010/wordprocessingShape" mc:Ignorable="w14 w15 w16se w16cid w16 w16cex w16sdtdh wp14">
   <w:endnote w:type="separator" w:id="-1">
     <w:p>
       <w:r>
@@ -1002,7 +1195,7 @@
 </file>
 
 <file path=word/footer1.xml><?xml version="1.0" encoding="utf-8"?>
-<w:ftr xmlns:wpc="http://schemas.microsoft.com/office/word/2010/wordprocessingCanvas" xmlns:cx="http://schemas.microsoft.com/office/drawing/2014/chartex" xmlns:cx1="http://schemas.microsoft.com/office/drawing/2015/9/8/chartex" xmlns:cx2="http://schemas.microsoft.com/office/drawing/2015/10/21/chartex" xmlns:cx3="http://schemas.microsoft.com/office/drawing/2016/5/9/chartex" xmlns:cx4="http://schemas.microsoft.com/office/drawing/2016/5/10/chartex" xmlns:cx5="http://schemas.microsoft.com/office/drawing/2016/5/11/chartex" xmlns:cx6="http://schemas.microsoft.com/office/drawing/2016/5/12/chartex" xmlns:cx7="http://schemas.microsoft.com/office/drawing/2016/5/13/chartex" xmlns:cx8="http://schemas.microsoft.com/office/drawing/2016/5/14/chartex" xmlns:mc="http://schemas.openxmlformats.org/markup-compatibility/2006" xmlns:aink="http://schemas.microsoft.com/office/drawing/2016/ink" xmlns:am3d="http://schemas.microsoft.com/office/drawing/2017/model3d" xmlns:o="urn:schemas-microsoft-com:office:office" xmlns:oel="http://schemas.microsoft.com/office/2019/extlst" xmlns:r="http://schemas.openxmlformats.org/officeDocument/2006/relationships" xmlns:m="http://schemas.openxmlformats.org/officeDocument/2006/math" xmlns:v="urn:schemas-microsoft-com:vml" xmlns:wp14="http://schemas.microsoft.com/office/word/2010/wordprocessingDrawing" xmlns:wp="http://schemas.openxmlformats.org/drawingml/2006/wordprocessingDrawing" xmlns:w10="urn:schemas-microsoft-com:office:word" xmlns:w="http://schemas.openxmlformats.org/wordprocessingml/2006/main" xmlns:w14="http://schemas.microsoft.com/office/word/2010/wordml" xmlns:w15="http://schemas.microsoft.com/office/word/2012/wordml" xmlns:w16cex="http://schemas.microsoft.com/office/word/2018/wordml/cex" xmlns:w16cid="http://schemas.microsoft.com/office/word/2016/wordml/cid" xmlns:w16="http://schemas.microsoft.com/office/word/2018/wordml" xmlns:w16du="http://schemas.microsoft.com/office/word/2023/wordml/word16du" xmlns:w16sdtdh="http://schemas.microsoft.com/office/word/2020/wordml/sdtdatahash" xmlns:w16se="http://schemas.microsoft.com/office/word/2015/wordml/symex" xmlns:wpg="http://schemas.microsoft.com/office/word/2010/wordprocessingGroup" xmlns:wpi="http://schemas.microsoft.com/office/word/2010/wordprocessingInk" xmlns:wne="http://schemas.microsoft.com/office/word/2006/wordml" xmlns:wps="http://schemas.microsoft.com/office/word/2010/wordprocessingShape" mc:Ignorable="w14 w15 w16se w16cid w16 w16cex w16sdtdh wp14">
+<w:ftr xmlns:wpc="http://schemas.microsoft.com/office/word/2010/wordprocessingCanvas" xmlns:cx="http://schemas.microsoft.com/office/drawing/2014/chartex" xmlns:cx1="http://schemas.microsoft.com/office/drawing/2015/9/8/chartex" xmlns:cx2="http://schemas.microsoft.com/office/drawing/2015/10/21/chartex" xmlns:cx3="http://schemas.microsoft.com/office/drawing/2016/5/9/chartex" xmlns:cx4="http://schemas.microsoft.com/office/drawing/2016/5/10/chartex" xmlns:cx5="http://schemas.microsoft.com/office/drawing/2016/5/11/chartex" xmlns:cx6="http://schemas.microsoft.com/office/drawing/2016/5/12/chartex" xmlns:cx7="http://schemas.microsoft.com/office/drawing/2016/5/13/chartex" xmlns:cx8="http://schemas.microsoft.com/office/drawing/2016/5/14/chartex" xmlns:mc="http://schemas.openxmlformats.org/markup-compatibility/2006" xmlns:aink="http://schemas.microsoft.com/office/drawing/2016/ink" xmlns:am3d="http://schemas.microsoft.com/office/drawing/2017/model3d" xmlns:o="urn:schemas-microsoft-com:office:office" xmlns:oel="http://schemas.microsoft.com/office/2019/extlst" xmlns:r="http://schemas.openxmlformats.org/officeDocument/2006/relationships" xmlns:m="http://schemas.openxmlformats.org/officeDocument/2006/math" xmlns:v="urn:schemas-microsoft-com:vml" xmlns:wp14="http://schemas.microsoft.com/office/word/2010/wordprocessingDrawing" xmlns:wp="http://schemas.openxmlformats.org/drawingml/2006/wordprocessingDrawing" xmlns:w10="urn:schemas-microsoft-com:office:word" xmlns:w="http://schemas.openxmlformats.org/wordprocessingml/2006/main" xmlns:w14="http://schemas.microsoft.com/office/word/2010/wordml" xmlns:w15="http://schemas.microsoft.com/office/word/2012/wordml" xmlns:w16cex="http://schemas.microsoft.com/office/word/2018/wordml/cex" xmlns:w16cid="http://schemas.microsoft.com/office/word/2016/wordml/cid" xmlns:w16="http://schemas.microsoft.com/office/word/2018/wordml" xmlns:w16sdtdh="http://schemas.microsoft.com/office/word/2020/wordml/sdtdatahash" xmlns:w16se="http://schemas.microsoft.com/office/word/2015/wordml/symex" xmlns:wpg="http://schemas.microsoft.com/office/word/2010/wordprocessingGroup" xmlns:wpi="http://schemas.microsoft.com/office/word/2010/wordprocessingInk" xmlns:wne="http://schemas.microsoft.com/office/word/2006/wordml" xmlns:wps="http://schemas.microsoft.com/office/word/2010/wordprocessingShape" mc:Ignorable="w14 w15 w16se w16cid w16 w16cex w16sdtdh wp14">
   <w:p>
     <w:pPr>
       <w:pStyle w:val="Footer"/>
@@ -1075,7 +1268,7 @@
             </wp:anchor>
           </w:drawing>
         </mc:Choice>
-        <mc:Fallback>
+        <mc:Fallback xmlns:w16du="http://schemas.microsoft.com/office/word/2023/wordml/word16du">
           <w:pict>
             <v:rect w14:anchorId="4D6A6D88" id="Rectangle 2" o:spid="_x0000_s1026" alt="&quot;&quot;" style="position:absolute;margin-left:36.45pt;margin-top:805.1pt;width:522.7pt;height:36.1pt;z-index:251659264;visibility:visible;mso-wrap-style:square;mso-width-percent:0;mso-height-percent:0;mso-wrap-distance-left:9pt;mso-wrap-distance-top:0;mso-wrap-distance-right:9pt;mso-wrap-distance-bottom:0;mso-position-horizontal:absolute;mso-position-horizontal-relative:page;mso-position-vertical:absolute;mso-position-vertical-relative:page;mso-width-percent:0;mso-height-percent:0;mso-width-relative:page;mso-height-relative:page;v-text-anchor:top" o:gfxdata="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" fillcolor="#604878 [3208]" stroked="f">
               <w10:wrap anchorx="page" anchory="page"/>
@@ -1089,7 +1282,7 @@
 </file>
 
 <file path=word/footnotes.xml><?xml version="1.0" encoding="utf-8"?>
-<w:footnotes xmlns:wpc="http://schemas.microsoft.com/office/word/2010/wordprocessingCanvas" xmlns:cx="http://schemas.microsoft.com/office/drawing/2014/chartex" xmlns:cx1="http://schemas.microsoft.com/office/drawing/2015/9/8/chartex" xmlns:cx2="http://schemas.microsoft.com/office/drawing/2015/10/21/chartex" xmlns:cx3="http://schemas.microsoft.com/office/drawing/2016/5/9/chartex" xmlns:cx4="http://schemas.microsoft.com/office/drawing/2016/5/10/chartex" xmlns:cx5="http://schemas.microsoft.com/office/drawing/2016/5/11/chartex" xmlns:cx6="http://schemas.microsoft.com/office/drawing/2016/5/12/chartex" xmlns:cx7="http://schemas.microsoft.com/office/drawing/2016/5/13/chartex" xmlns:cx8="http://schemas.microsoft.com/office/drawing/2016/5/14/chartex" xmlns:mc="http://schemas.openxmlformats.org/markup-compatibility/2006" xmlns:aink="http://schemas.microsoft.com/office/drawing/2016/ink" xmlns:am3d="http://schemas.microsoft.com/office/drawing/2017/model3d" xmlns:o="urn:schemas-microsoft-com:office:office" xmlns:oel="http://schemas.microsoft.com/office/2019/extlst" xmlns:r="http://schemas.openxmlformats.org/officeDocument/2006/relationships" xmlns:m="http://schemas.openxmlformats.org/officeDocument/2006/math" xmlns:v="urn:schemas-microsoft-com:vml" xmlns:wp14="http://schemas.microsoft.com/office/word/2010/wordprocessingDrawing" xmlns:wp="http://schemas.openxmlformats.org/drawingml/2006/wordprocessingDrawing" xmlns:w10="urn:schemas-microsoft-com:office:word" xmlns:w="http://schemas.openxmlformats.org/wordprocessingml/2006/main" xmlns:w14="http://schemas.microsoft.com/office/word/2010/wordml" xmlns:w15="http://schemas.microsoft.com/office/word/2012/wordml" xmlns:w16cex="http://schemas.microsoft.com/office/word/2018/wordml/cex" xmlns:w16cid="http://schemas.microsoft.com/office/word/2016/wordml/cid" xmlns:w16="http://schemas.microsoft.com/office/word/2018/wordml" xmlns:w16du="http://schemas.microsoft.com/office/word/2023/wordml/word16du" xmlns:w16sdtdh="http://schemas.microsoft.com/office/word/2020/wordml/sdtdatahash" xmlns:w16se="http://schemas.microsoft.com/office/word/2015/wordml/symex" xmlns:wpg="http://schemas.microsoft.com/office/word/2010/wordprocessingGroup" xmlns:wpi="http://schemas.microsoft.com/office/word/2010/wordprocessingInk" xmlns:wne="http://schemas.microsoft.com/office/word/2006/wordml" xmlns:wps="http://schemas.microsoft.com/office/word/2010/wordprocessingShape" mc:Ignorable="w14 w15 w16se w16cid w16 w16cex w16sdtdh wp14">
+<w:footnotes xmlns:wpc="http://schemas.microsoft.com/office/word/2010/wordprocessingCanvas" xmlns:cx="http://schemas.microsoft.com/office/drawing/2014/chartex" xmlns:cx1="http://schemas.microsoft.com/office/drawing/2015/9/8/chartex" xmlns:cx2="http://schemas.microsoft.com/office/drawing/2015/10/21/chartex" xmlns:cx3="http://schemas.microsoft.com/office/drawing/2016/5/9/chartex" xmlns:cx4="http://schemas.microsoft.com/office/drawing/2016/5/10/chartex" xmlns:cx5="http://schemas.microsoft.com/office/drawing/2016/5/11/chartex" xmlns:cx6="http://schemas.microsoft.com/office/drawing/2016/5/12/chartex" xmlns:cx7="http://schemas.microsoft.com/office/drawing/2016/5/13/chartex" xmlns:cx8="http://schemas.microsoft.com/office/drawing/2016/5/14/chartex" xmlns:mc="http://schemas.openxmlformats.org/markup-compatibility/2006" xmlns:aink="http://schemas.microsoft.com/office/drawing/2016/ink" xmlns:am3d="http://schemas.microsoft.com/office/drawing/2017/model3d" xmlns:o="urn:schemas-microsoft-com:office:office" xmlns:oel="http://schemas.microsoft.com/office/2019/extlst" xmlns:r="http://schemas.openxmlformats.org/officeDocument/2006/relationships" xmlns:m="http://schemas.openxmlformats.org/officeDocument/2006/math" xmlns:v="urn:schemas-microsoft-com:vml" xmlns:wp14="http://schemas.microsoft.com/office/word/2010/wordprocessingDrawing" xmlns:wp="http://schemas.openxmlformats.org/drawingml/2006/wordprocessingDrawing" xmlns:w10="urn:schemas-microsoft-com:office:word" xmlns:w="http://schemas.openxmlformats.org/wordprocessingml/2006/main" xmlns:w14="http://schemas.microsoft.com/office/word/2010/wordml" xmlns:w15="http://schemas.microsoft.com/office/word/2012/wordml" xmlns:w16cex="http://schemas.microsoft.com/office/word/2018/wordml/cex" xmlns:w16cid="http://schemas.microsoft.com/office/word/2016/wordml/cid" xmlns:w16="http://schemas.microsoft.com/office/word/2018/wordml" xmlns:w16sdtdh="http://schemas.microsoft.com/office/word/2020/wordml/sdtdatahash" xmlns:w16se="http://schemas.microsoft.com/office/word/2015/wordml/symex" xmlns:wpg="http://schemas.microsoft.com/office/word/2010/wordprocessingGroup" xmlns:wpi="http://schemas.microsoft.com/office/word/2010/wordprocessingInk" xmlns:wne="http://schemas.microsoft.com/office/word/2006/wordml" xmlns:wps="http://schemas.microsoft.com/office/word/2010/wordprocessingShape" mc:Ignorable="w14 w15 w16se w16cid w16 w16cex w16sdtdh wp14">
   <w:footnote w:type="separator" w:id="-1">
     <w:p>
       <w:r>
@@ -1108,7 +1301,7 @@
 </file>
 
 <file path=word/numbering.xml><?xml version="1.0" encoding="utf-8"?>
-<w:numbering xmlns:wpc="http://schemas.microsoft.com/office/word/2010/wordprocessingCanvas" xmlns:cx="http://schemas.microsoft.com/office/drawing/2014/chartex" xmlns:cx1="http://schemas.microsoft.com/office/drawing/2015/9/8/chartex" xmlns:cx2="http://schemas.microsoft.com/office/drawing/2015/10/21/chartex" xmlns:cx3="http://schemas.microsoft.com/office/drawing/2016/5/9/chartex" xmlns:cx4="http://schemas.microsoft.com/office/drawing/2016/5/10/chartex" xmlns:cx5="http://schemas.microsoft.com/office/drawing/2016/5/11/chartex" xmlns:cx6="http://schemas.microsoft.com/office/drawing/2016/5/12/chartex" xmlns:cx7="http://schemas.microsoft.com/office/drawing/2016/5/13/chartex" xmlns:cx8="http://schemas.microsoft.com/office/drawing/2016/5/14/chartex" xmlns:mc="http://schemas.openxmlformats.org/markup-compatibility/2006" xmlns:aink="http://schemas.microsoft.com/office/drawing/2016/ink" xmlns:am3d="http://schemas.microsoft.com/office/drawing/2017/model3d" xmlns:o="urn:schemas-microsoft-com:office:office" xmlns:oel="http://schemas.microsoft.com/office/2019/extlst" xmlns:r="http://schemas.openxmlformats.org/officeDocument/2006/relationships" xmlns:m="http://schemas.openxmlformats.org/officeDocument/2006/math" xmlns:v="urn:schemas-microsoft-com:vml" xmlns:wp14="http://schemas.microsoft.com/office/word/2010/wordprocessingDrawing" xmlns:wp="http://schemas.openxmlformats.org/drawingml/2006/wordprocessingDrawing" xmlns:w10="urn:schemas-microsoft-com:office:word" xmlns:w="http://schemas.openxmlformats.org/wordprocessingml/2006/main" xmlns:w14="http://schemas.microsoft.com/office/word/2010/wordml" xmlns:w15="http://schemas.microsoft.com/office/word/2012/wordml" xmlns:w16cex="http://schemas.microsoft.com/office/word/2018/wordml/cex" xmlns:w16cid="http://schemas.microsoft.com/office/word/2016/wordml/cid" xmlns:w16="http://schemas.microsoft.com/office/word/2018/wordml" xmlns:w16du="http://schemas.microsoft.com/office/word/2023/wordml/word16du" xmlns:w16sdtdh="http://schemas.microsoft.com/office/word/2020/wordml/sdtdatahash" xmlns:w16se="http://schemas.microsoft.com/office/word/2015/wordml/symex" xmlns:wpg="http://schemas.microsoft.com/office/word/2010/wordprocessingGroup" xmlns:wpi="http://schemas.microsoft.com/office/word/2010/wordprocessingInk" xmlns:wne="http://schemas.microsoft.com/office/word/2006/wordml" xmlns:wps="http://schemas.microsoft.com/office/word/2010/wordprocessingShape" mc:Ignorable="w14 w15 w16se w16cid w16 w16cex w16sdtdh wp14">
+<w:numbering xmlns:wpc="http://schemas.microsoft.com/office/word/2010/wordprocessingCanvas" xmlns:cx="http://schemas.microsoft.com/office/drawing/2014/chartex" xmlns:cx1="http://schemas.microsoft.com/office/drawing/2015/9/8/chartex" xmlns:cx2="http://schemas.microsoft.com/office/drawing/2015/10/21/chartex" xmlns:cx3="http://schemas.microsoft.com/office/drawing/2016/5/9/chartex" xmlns:cx4="http://schemas.microsoft.com/office/drawing/2016/5/10/chartex" xmlns:cx5="http://schemas.microsoft.com/office/drawing/2016/5/11/chartex" xmlns:cx6="http://schemas.microsoft.com/office/drawing/2016/5/12/chartex" xmlns:cx7="http://schemas.microsoft.com/office/drawing/2016/5/13/chartex" xmlns:cx8="http://schemas.microsoft.com/office/drawing/2016/5/14/chartex" xmlns:mc="http://schemas.openxmlformats.org/markup-compatibility/2006" xmlns:aink="http://schemas.microsoft.com/office/drawing/2016/ink" xmlns:am3d="http://schemas.microsoft.com/office/drawing/2017/model3d" xmlns:o="urn:schemas-microsoft-com:office:office" xmlns:oel="http://schemas.microsoft.com/office/2019/extlst" xmlns:r="http://schemas.openxmlformats.org/officeDocument/2006/relationships" xmlns:m="http://schemas.openxmlformats.org/officeDocument/2006/math" xmlns:v="urn:schemas-microsoft-com:vml" xmlns:wp14="http://schemas.microsoft.com/office/word/2010/wordprocessingDrawing" xmlns:wp="http://schemas.openxmlformats.org/drawingml/2006/wordprocessingDrawing" xmlns:w10="urn:schemas-microsoft-com:office:word" xmlns:w="http://schemas.openxmlformats.org/wordprocessingml/2006/main" xmlns:w14="http://schemas.microsoft.com/office/word/2010/wordml" xmlns:w15="http://schemas.microsoft.com/office/word/2012/wordml" xmlns:w16cex="http://schemas.microsoft.com/office/word/2018/wordml/cex" xmlns:w16cid="http://schemas.microsoft.com/office/word/2016/wordml/cid" xmlns:w16="http://schemas.microsoft.com/office/word/2018/wordml" xmlns:w16sdtdh="http://schemas.microsoft.com/office/word/2020/wordml/sdtdatahash" xmlns:w16se="http://schemas.microsoft.com/office/word/2015/wordml/symex" xmlns:wpg="http://schemas.microsoft.com/office/word/2010/wordprocessingGroup" xmlns:wpi="http://schemas.microsoft.com/office/word/2010/wordprocessingInk" xmlns:wne="http://schemas.microsoft.com/office/word/2006/wordml" xmlns:wps="http://schemas.microsoft.com/office/word/2010/wordprocessingShape" mc:Ignorable="w14 w15 w16se w16cid w16 w16cex w16sdtdh wp14">
   <w:abstractNum w:abstractNumId="0" w15:restartNumberingAfterBreak="0">
     <w:nsid w:val="FFFFFF7C"/>
     <w:multiLevelType w:val="singleLevel"/>
@@ -2912,7 +3105,7 @@
       <w:color w:val="000000" w:themeColor="text1"/>
     </w:rPr>
   </w:style>
-  <w:style w:type="table" w:styleId="ColorfulGrid">
+  <w:style w:type="table" w:styleId="ColourfulGrid">
     <w:name w:val="Colorful Grid"/>
     <w:basedOn w:val="TableNormal"/>
     <w:uiPriority w:val="73"/>
@@ -2984,7 +3177,7 @@
       </w:tcPr>
     </w:tblStylePr>
   </w:style>
-  <w:style w:type="table" w:styleId="ColorfulGrid-Accent1">
+  <w:style w:type="table" w:styleId="ColourfulGridAccent1">
     <w:name w:val="Colorful Grid Accent 1"/>
     <w:basedOn w:val="TableNormal"/>
     <w:uiPriority w:val="73"/>
@@ -3056,7 +3249,7 @@
       </w:tcPr>
     </w:tblStylePr>
   </w:style>
-  <w:style w:type="table" w:styleId="ColorfulGrid-Accent2">
+  <w:style w:type="table" w:styleId="ColourfulGridAccent2">
     <w:name w:val="Colorful Grid Accent 2"/>
     <w:basedOn w:val="TableNormal"/>
     <w:uiPriority w:val="73"/>
@@ -3128,7 +3321,7 @@
       </w:tcPr>
     </w:tblStylePr>
   </w:style>
-  <w:style w:type="table" w:styleId="ColorfulGrid-Accent3">
+  <w:style w:type="table" w:styleId="ColourfulGridAccent3">
     <w:name w:val="Colorful Grid Accent 3"/>
     <w:basedOn w:val="TableNormal"/>
     <w:uiPriority w:val="73"/>
@@ -3200,7 +3393,7 @@
       </w:tcPr>
     </w:tblStylePr>
   </w:style>
-  <w:style w:type="table" w:styleId="ColorfulGrid-Accent4">
+  <w:style w:type="table" w:styleId="ColourfulGridAccent4">
     <w:name w:val="Colorful Grid Accent 4"/>
     <w:basedOn w:val="TableNormal"/>
     <w:uiPriority w:val="73"/>
@@ -3272,7 +3465,7 @@
       </w:tcPr>
     </w:tblStylePr>
   </w:style>
-  <w:style w:type="table" w:styleId="ColorfulGrid-Accent5">
+  <w:style w:type="table" w:styleId="ColourfulGridAccent5">
     <w:name w:val="Colorful Grid Accent 5"/>
     <w:basedOn w:val="TableNormal"/>
     <w:uiPriority w:val="73"/>
@@ -3344,7 +3537,7 @@
       </w:tcPr>
     </w:tblStylePr>
   </w:style>
-  <w:style w:type="table" w:styleId="ColorfulGrid-Accent6">
+  <w:style w:type="table" w:styleId="ColourfulGridAccent6">
     <w:name w:val="Colorful Grid Accent 6"/>
     <w:basedOn w:val="TableNormal"/>
     <w:uiPriority w:val="73"/>
@@ -3416,7 +3609,7 @@
       </w:tcPr>
     </w:tblStylePr>
   </w:style>
-  <w:style w:type="table" w:styleId="ColorfulList">
+  <w:style w:type="table" w:styleId="ColourfulList">
     <w:name w:val="Colorful List"/>
     <w:basedOn w:val="TableNormal"/>
     <w:uiPriority w:val="72"/>
@@ -3494,7 +3687,7 @@
       </w:tcPr>
     </w:tblStylePr>
   </w:style>
-  <w:style w:type="table" w:styleId="ColorfulList-Accent1">
+  <w:style w:type="table" w:styleId="ColourfulListAccent1">
     <w:name w:val="Colorful List Accent 1"/>
     <w:basedOn w:val="TableNormal"/>
     <w:uiPriority w:val="72"/>
@@ -3572,7 +3765,7 @@
       </w:tcPr>
     </w:tblStylePr>
   </w:style>
-  <w:style w:type="table" w:styleId="ColorfulList-Accent2">
+  <w:style w:type="table" w:styleId="ColourfulListAccent2">
     <w:name w:val="Colorful List Accent 2"/>
     <w:basedOn w:val="TableNormal"/>
     <w:uiPriority w:val="72"/>
@@ -3650,7 +3843,7 @@
       </w:tcPr>
     </w:tblStylePr>
   </w:style>
-  <w:style w:type="table" w:styleId="ColorfulList-Accent3">
+  <w:style w:type="table" w:styleId="ColourfulListAccent3">
     <w:name w:val="Colorful List Accent 3"/>
     <w:basedOn w:val="TableNormal"/>
     <w:uiPriority w:val="72"/>
@@ -3728,7 +3921,7 @@
       </w:tcPr>
     </w:tblStylePr>
   </w:style>
-  <w:style w:type="table" w:styleId="ColorfulList-Accent4">
+  <w:style w:type="table" w:styleId="ColourfulListAccent4">
     <w:name w:val="Colorful List Accent 4"/>
     <w:basedOn w:val="TableNormal"/>
     <w:uiPriority w:val="72"/>
@@ -3806,7 +3999,7 @@
       </w:tcPr>
     </w:tblStylePr>
   </w:style>
-  <w:style w:type="table" w:styleId="ColorfulList-Accent5">
+  <w:style w:type="table" w:styleId="ColourfulListAccent5">
     <w:name w:val="Colorful List Accent 5"/>
     <w:basedOn w:val="TableNormal"/>
     <w:uiPriority w:val="72"/>
@@ -3884,7 +4077,7 @@
       </w:tcPr>
     </w:tblStylePr>
   </w:style>
-  <w:style w:type="table" w:styleId="ColorfulList-Accent6">
+  <w:style w:type="table" w:styleId="ColourfulListAccent6">
     <w:name w:val="Colorful List Accent 6"/>
     <w:basedOn w:val="TableNormal"/>
     <w:uiPriority w:val="72"/>
@@ -3962,7 +4155,7 @@
       </w:tcPr>
     </w:tblStylePr>
   </w:style>
-  <w:style w:type="table" w:styleId="ColorfulShading">
+  <w:style w:type="table" w:styleId="ColourfulShading">
     <w:name w:val="Colorful Shading"/>
     <w:basedOn w:val="TableNormal"/>
     <w:uiPriority w:val="71"/>
@@ -4076,7 +4269,7 @@
       </w:rPr>
     </w:tblStylePr>
   </w:style>
-  <w:style w:type="table" w:styleId="ColorfulShading-Accent1">
+  <w:style w:type="table" w:styleId="ColourfulShadingAccent1">
     <w:name w:val="Colorful Shading Accent 1"/>
     <w:basedOn w:val="TableNormal"/>
     <w:uiPriority w:val="71"/>
@@ -4190,7 +4383,7 @@
       </w:rPr>
     </w:tblStylePr>
   </w:style>
-  <w:style w:type="table" w:styleId="ColorfulShading-Accent2">
+  <w:style w:type="table" w:styleId="ColourfulShadingAccent2">
     <w:name w:val="Colorful Shading Accent 2"/>
     <w:basedOn w:val="TableNormal"/>
     <w:uiPriority w:val="71"/>
@@ -4304,7 +4497,7 @@
       </w:rPr>
     </w:tblStylePr>
   </w:style>
-  <w:style w:type="table" w:styleId="ColorfulShading-Accent3">
+  <w:style w:type="table" w:styleId="ColourfulShadingAccent3">
     <w:name w:val="Colorful Shading Accent 3"/>
     <w:basedOn w:val="TableNormal"/>
     <w:uiPriority w:val="71"/>
@@ -4408,7 +4601,7 @@
       </w:tcPr>
     </w:tblStylePr>
   </w:style>
-  <w:style w:type="table" w:styleId="ColorfulShading-Accent4">
+  <w:style w:type="table" w:styleId="ColourfulShadingAccent4">
     <w:name w:val="Colorful Shading Accent 4"/>
     <w:basedOn w:val="TableNormal"/>
     <w:uiPriority w:val="71"/>
@@ -4522,7 +4715,7 @@
       </w:rPr>
     </w:tblStylePr>
   </w:style>
-  <w:style w:type="table" w:styleId="ColorfulShading-Accent5">
+  <w:style w:type="table" w:styleId="ColourfulShadingAccent5">
     <w:name w:val="Colorful Shading Accent 5"/>
     <w:basedOn w:val="TableNormal"/>
     <w:uiPriority w:val="71"/>
@@ -4636,7 +4829,7 @@
       </w:rPr>
     </w:tblStylePr>
   </w:style>
-  <w:style w:type="table" w:styleId="ColorfulShading-Accent6">
+  <w:style w:type="table" w:styleId="ColourfulShadingAccent6">
     <w:name w:val="Colorful Shading Accent 6"/>
     <w:basedOn w:val="TableNormal"/>
     <w:uiPriority w:val="71"/>
@@ -5612,19 +5805,19 @@
       <w:szCs w:val="16"/>
     </w:rPr>
   </w:style>
-  <w:style w:type="paragraph" w:styleId="E-mailSignature">
+  <w:style w:type="paragraph" w:styleId="EmailSignature">
     <w:name w:val="E-mail Signature"/>
     <w:basedOn w:val="Normal"/>
-    <w:link w:val="E-mailSignatureChar"/>
+    <w:link w:val="EmailSignatureChar"/>
     <w:uiPriority w:val="99"/>
     <w:semiHidden/>
     <w:unhideWhenUsed/>
     <w:rsid w:val="00AD4397"/>
   </w:style>
-  <w:style w:type="character" w:customStyle="1" w:styleId="E-mailSignatureChar">
-    <w:name w:val="E-mail Signature Char"/>
+  <w:style w:type="character" w:customStyle="1" w:styleId="EmailSignatureChar">
+    <w:name w:val="Email Signature Char"/>
     <w:basedOn w:val="DefaultParagraphFont"/>
-    <w:link w:val="E-mailSignature"/>
+    <w:link w:val="EmailSignature"/>
     <w:uiPriority w:val="99"/>
     <w:semiHidden/>
     <w:rsid w:val="00AD4397"/>
@@ -5860,7 +6053,7 @@
       </w:rPr>
     </w:tblStylePr>
   </w:style>
-  <w:style w:type="table" w:styleId="GridTable1Light-Accent2">
+  <w:style w:type="table" w:styleId="GridTable1LightAccent2">
     <w:name w:val="Grid Table 1 Light Accent 2"/>
     <w:basedOn w:val="TableNormal"/>
     <w:uiPriority w:val="46"/>
@@ -8797,7 +8990,7 @@
       </w:tcPr>
     </w:tblStylePr>
   </w:style>
-  <w:style w:type="table" w:styleId="GridTable6Colorful">
+  <w:style w:type="table" w:styleId="GridTable6Colourful">
     <w:name w:val="Grid Table 6 Colorful"/>
     <w:basedOn w:val="TableNormal"/>
     <w:uiPriority w:val="51"/>
@@ -8866,7 +9059,7 @@
       </w:tcPr>
     </w:tblStylePr>
   </w:style>
-  <w:style w:type="table" w:styleId="GridTable6Colorful-Accent1">
+  <w:style w:type="table" w:styleId="GridTable6ColourfulAccent1">
     <w:name w:val="Grid Table 6 Colorful Accent 1"/>
     <w:basedOn w:val="TableNormal"/>
     <w:uiPriority w:val="51"/>
@@ -8935,7 +9128,7 @@
       </w:tcPr>
     </w:tblStylePr>
   </w:style>
-  <w:style w:type="table" w:styleId="GridTable6Colorful-Accent2">
+  <w:style w:type="table" w:styleId="GridTable6ColourfulAccent2">
     <w:name w:val="Grid Table 6 Colorful Accent 2"/>
     <w:basedOn w:val="TableNormal"/>
     <w:uiPriority w:val="51"/>
@@ -9004,7 +9197,7 @@
       </w:tcPr>
     </w:tblStylePr>
   </w:style>
-  <w:style w:type="table" w:styleId="GridTable6Colorful-Accent3">
+  <w:style w:type="table" w:styleId="GridTable6ColourfulAccent3">
     <w:name w:val="Grid Table 6 Colorful Accent 3"/>
     <w:basedOn w:val="TableNormal"/>
     <w:uiPriority w:val="51"/>
@@ -9073,7 +9266,7 @@
       </w:tcPr>
     </w:tblStylePr>
   </w:style>
-  <w:style w:type="table" w:styleId="GridTable6Colorful-Accent4">
+  <w:style w:type="table" w:styleId="GridTable6ColourfulAccent4">
     <w:name w:val="Grid Table 6 Colorful Accent 4"/>
     <w:basedOn w:val="TableNormal"/>
     <w:uiPriority w:val="51"/>
@@ -9142,7 +9335,7 @@
       </w:tcPr>
     </w:tblStylePr>
   </w:style>
-  <w:style w:type="table" w:styleId="GridTable6Colorful-Accent5">
+  <w:style w:type="table" w:styleId="GridTable6ColourfulAccent5">
     <w:name w:val="Grid Table 6 Colorful Accent 5"/>
     <w:basedOn w:val="TableNormal"/>
     <w:uiPriority w:val="51"/>
@@ -9211,7 +9404,7 @@
       </w:tcPr>
     </w:tblStylePr>
   </w:style>
-  <w:style w:type="table" w:styleId="GridTable6Colorful-Accent6">
+  <w:style w:type="table" w:styleId="GridTable6ColourfulAccent6">
     <w:name w:val="Grid Table 6 Colorful Accent 6"/>
     <w:basedOn w:val="TableNormal"/>
     <w:uiPriority w:val="51"/>
@@ -9280,7 +9473,7 @@
       </w:tcPr>
     </w:tblStylePr>
   </w:style>
-  <w:style w:type="table" w:styleId="GridTable7Colorful">
+  <w:style w:type="table" w:styleId="GridTable7Colourful">
     <w:name w:val="Grid Table 7 Colorful"/>
     <w:basedOn w:val="TableNormal"/>
     <w:uiPriority w:val="52"/>
@@ -9416,7 +9609,7 @@
       </w:tcPr>
     </w:tblStylePr>
   </w:style>
-  <w:style w:type="table" w:styleId="GridTable7Colorful-Accent1">
+  <w:style w:type="table" w:styleId="GridTable7ColourfulAccent1">
     <w:name w:val="Grid Table 7 Colorful Accent 1"/>
     <w:basedOn w:val="TableNormal"/>
     <w:uiPriority w:val="52"/>
@@ -9552,7 +9745,7 @@
       </w:tcPr>
     </w:tblStylePr>
   </w:style>
-  <w:style w:type="table" w:styleId="GridTable7Colorful-Accent2">
+  <w:style w:type="table" w:styleId="GridTable7ColourfulAccent2">
     <w:name w:val="Grid Table 7 Colorful Accent 2"/>
     <w:basedOn w:val="TableNormal"/>
     <w:uiPriority w:val="52"/>
@@ -9688,7 +9881,7 @@
       </w:tcPr>
     </w:tblStylePr>
   </w:style>
-  <w:style w:type="table" w:styleId="GridTable7Colorful-Accent3">
+  <w:style w:type="table" w:styleId="GridTable7ColourfulAccent3">
     <w:name w:val="Grid Table 7 Colorful Accent 3"/>
     <w:basedOn w:val="TableNormal"/>
     <w:uiPriority w:val="52"/>
@@ -9824,7 +10017,7 @@
       </w:tcPr>
     </w:tblStylePr>
   </w:style>
-  <w:style w:type="table" w:styleId="GridTable7Colorful-Accent4">
+  <w:style w:type="table" w:styleId="GridTable7ColourfulAccent4">
     <w:name w:val="Grid Table 7 Colorful Accent 4"/>
     <w:basedOn w:val="TableNormal"/>
     <w:uiPriority w:val="52"/>
@@ -9960,7 +10153,7 @@
       </w:tcPr>
     </w:tblStylePr>
   </w:style>
-  <w:style w:type="table" w:styleId="GridTable7Colorful-Accent5">
+  <w:style w:type="table" w:styleId="GridTable7ColourfulAccent5">
     <w:name w:val="Grid Table 7 Colorful Accent 5"/>
     <w:basedOn w:val="TableNormal"/>
     <w:uiPriority w:val="52"/>
@@ -10096,7 +10289,7 @@
       </w:tcPr>
     </w:tblStylePr>
   </w:style>
-  <w:style w:type="table" w:styleId="GridTable7Colorful-Accent6">
+  <w:style w:type="table" w:styleId="GridTable7ColourfulAccent6">
     <w:name w:val="Grid Table 7 Colorful Accent 6"/>
     <w:basedOn w:val="TableNormal"/>
     <w:uiPriority w:val="52"/>
@@ -16032,7 +16225,7 @@
       </w:tcPr>
     </w:tblStylePr>
   </w:style>
-  <w:style w:type="table" w:styleId="ListTable6Colorful">
+  <w:style w:type="table" w:styleId="ListTable6Colourful">
     <w:name w:val="List Table 6 Colorful"/>
     <w:basedOn w:val="TableNormal"/>
     <w:uiPriority w:val="51"/>
@@ -16097,7 +16290,7 @@
       </w:tcPr>
     </w:tblStylePr>
   </w:style>
-  <w:style w:type="table" w:styleId="ListTable6Colorful-Accent1">
+  <w:style w:type="table" w:styleId="ListTable6ColourfulAccent1">
     <w:name w:val="List Table 6 Colorful Accent 1"/>
     <w:basedOn w:val="TableNormal"/>
     <w:uiPriority w:val="51"/>
@@ -16162,7 +16355,7 @@
       </w:tcPr>
     </w:tblStylePr>
   </w:style>
-  <w:style w:type="table" w:styleId="ListTable6Colorful-Accent2">
+  <w:style w:type="table" w:styleId="ListTable6ColourfulAccent2">
     <w:name w:val="List Table 6 Colorful Accent 2"/>
     <w:basedOn w:val="TableNormal"/>
     <w:uiPriority w:val="51"/>
@@ -16227,7 +16420,7 @@
       </w:tcPr>
     </w:tblStylePr>
   </w:style>
-  <w:style w:type="table" w:styleId="ListTable6Colorful-Accent3">
+  <w:style w:type="table" w:styleId="ListTable6ColourfulAccent3">
     <w:name w:val="List Table 6 Colorful Accent 3"/>
     <w:basedOn w:val="TableNormal"/>
     <w:uiPriority w:val="51"/>
@@ -16292,7 +16485,7 @@
       </w:tcPr>
     </w:tblStylePr>
   </w:style>
-  <w:style w:type="table" w:styleId="ListTable6Colorful-Accent4">
+  <w:style w:type="table" w:styleId="ListTable6ColourfulAccent4">
     <w:name w:val="List Table 6 Colorful Accent 4"/>
     <w:basedOn w:val="TableNormal"/>
     <w:uiPriority w:val="51"/>
@@ -16357,7 +16550,7 @@
       </w:tcPr>
     </w:tblStylePr>
   </w:style>
-  <w:style w:type="table" w:styleId="ListTable6Colorful-Accent5">
+  <w:style w:type="table" w:styleId="ListTable6ColourfulAccent5">
     <w:name w:val="List Table 6 Colorful Accent 5"/>
     <w:basedOn w:val="TableNormal"/>
     <w:uiPriority w:val="51"/>
@@ -16422,7 +16615,7 @@
       </w:tcPr>
     </w:tblStylePr>
   </w:style>
-  <w:style w:type="table" w:styleId="ListTable6Colorful-Accent6">
+  <w:style w:type="table" w:styleId="ListTable6ColourfulAccent6">
     <w:name w:val="List Table 6 Colorful Accent 6"/>
     <w:basedOn w:val="TableNormal"/>
     <w:uiPriority w:val="51"/>
@@ -16487,7 +16680,7 @@
       </w:tcPr>
     </w:tblStylePr>
   </w:style>
-  <w:style w:type="table" w:styleId="ListTable7Colorful">
+  <w:style w:type="table" w:styleId="ListTable7Colourful">
     <w:name w:val="List Table 7 Colorful"/>
     <w:basedOn w:val="TableNormal"/>
     <w:uiPriority w:val="52"/>
@@ -16607,7 +16800,7 @@
       </w:tcPr>
     </w:tblStylePr>
   </w:style>
-  <w:style w:type="table" w:styleId="ListTable7Colorful-Accent1">
+  <w:style w:type="table" w:styleId="ListTable7ColourfulAccent1">
     <w:name w:val="List Table 7 Colorful Accent 1"/>
     <w:basedOn w:val="TableNormal"/>
     <w:uiPriority w:val="52"/>
@@ -16727,7 +16920,7 @@
       </w:tcPr>
     </w:tblStylePr>
   </w:style>
-  <w:style w:type="table" w:styleId="ListTable7Colorful-Accent2">
+  <w:style w:type="table" w:styleId="ListTable7ColourfulAccent2">
     <w:name w:val="List Table 7 Colorful Accent 2"/>
     <w:basedOn w:val="TableNormal"/>
     <w:uiPriority w:val="52"/>
@@ -16847,7 +17040,7 @@
       </w:tcPr>
     </w:tblStylePr>
   </w:style>
-  <w:style w:type="table" w:styleId="ListTable7Colorful-Accent3">
+  <w:style w:type="table" w:styleId="ListTable7ColourfulAccent3">
     <w:name w:val="List Table 7 Colorful Accent 3"/>
     <w:basedOn w:val="TableNormal"/>
     <w:uiPriority w:val="52"/>
@@ -16967,7 +17160,7 @@
       </w:tcPr>
     </w:tblStylePr>
   </w:style>
-  <w:style w:type="table" w:styleId="ListTable7Colorful-Accent4">
+  <w:style w:type="table" w:styleId="ListTable7ColourfulAccent4">
     <w:name w:val="List Table 7 Colorful Accent 4"/>
     <w:basedOn w:val="TableNormal"/>
     <w:uiPriority w:val="52"/>
@@ -17087,7 +17280,7 @@
       </w:tcPr>
     </w:tblStylePr>
   </w:style>
-  <w:style w:type="table" w:styleId="ListTable7Colorful-Accent5">
+  <w:style w:type="table" w:styleId="ListTable7ColourfulAccent5">
     <w:name w:val="List Table 7 Colorful Accent 5"/>
     <w:basedOn w:val="TableNormal"/>
     <w:uiPriority w:val="52"/>
@@ -17207,7 +17400,7 @@
       </w:tcPr>
     </w:tblStylePr>
   </w:style>
-  <w:style w:type="table" w:styleId="ListTable7Colorful-Accent6">
+  <w:style w:type="table" w:styleId="ListTable7ColourfulAccent6">
     <w:name w:val="List Table 7 Colorful Accent 6"/>
     <w:basedOn w:val="TableNormal"/>
     <w:uiPriority w:val="52"/>
@@ -23881,7 +24074,7 @@
       </w:tcPr>
     </w:tblStylePr>
   </w:style>
-  <w:style w:type="table" w:styleId="TableColorful1">
+  <w:style w:type="table" w:styleId="TableColourful1">
     <w:name w:val="Table Colorful 1"/>
     <w:basedOn w:val="TableNormal"/>
     <w:uiPriority w:val="99"/>
@@ -23961,7 +24154,7 @@
       </w:tcPr>
     </w:tblStylePr>
   </w:style>
-  <w:style w:type="table" w:styleId="TableColorful2">
+  <w:style w:type="table" w:styleId="TableColourful2">
     <w:name w:val="Table Colorful 2"/>
     <w:basedOn w:val="TableNormal"/>
     <w:uiPriority w:val="99"/>
@@ -24035,7 +24228,7 @@
       </w:tcPr>
     </w:tblStylePr>
   </w:style>
-  <w:style w:type="table" w:styleId="TableColorful3">
+  <w:style w:type="table" w:styleId="TableColourful3">
     <w:name w:val="Table Colorful 3"/>
     <w:basedOn w:val="TableNormal"/>
     <w:uiPriority w:val="99"/>
@@ -26486,7 +26679,7 @@
 </file>
 
 <file path=word/glossary/document.xml><?xml version="1.0" encoding="utf-8"?>
-<w:glossaryDocument xmlns:wpc="http://schemas.microsoft.com/office/word/2010/wordprocessingCanvas" xmlns:cx="http://schemas.microsoft.com/office/drawing/2014/chartex" xmlns:cx1="http://schemas.microsoft.com/office/drawing/2015/9/8/chartex" xmlns:cx2="http://schemas.microsoft.com/office/drawing/2015/10/21/chartex" xmlns:cx3="http://schemas.microsoft.com/office/drawing/2016/5/9/chartex" xmlns:cx4="http://schemas.microsoft.com/office/drawing/2016/5/10/chartex" xmlns:cx5="http://schemas.microsoft.com/office/drawing/2016/5/11/chartex" xmlns:cx6="http://schemas.microsoft.com/office/drawing/2016/5/12/chartex" xmlns:cx7="http://schemas.microsoft.com/office/drawing/2016/5/13/chartex" xmlns:cx8="http://schemas.microsoft.com/office/drawing/2016/5/14/chartex" xmlns:mc="http://schemas.openxmlformats.org/markup-compatibility/2006" xmlns:aink="http://schemas.microsoft.com/office/drawing/2016/ink" xmlns:am3d="http://schemas.microsoft.com/office/drawing/2017/model3d" xmlns:o="urn:schemas-microsoft-com:office:office" xmlns:oel="http://schemas.microsoft.com/office/2019/extlst" xmlns:r="http://schemas.openxmlformats.org/officeDocument/2006/relationships" xmlns:m="http://schemas.openxmlformats.org/officeDocument/2006/math" xmlns:v="urn:schemas-microsoft-com:vml" xmlns:wp14="http://schemas.microsoft.com/office/word/2010/wordprocessingDrawing" xmlns:wp="http://schemas.openxmlformats.org/drawingml/2006/wordprocessingDrawing" xmlns:w10="urn:schemas-microsoft-com:office:word" xmlns:w="http://schemas.openxmlformats.org/wordprocessingml/2006/main" xmlns:w14="http://schemas.microsoft.com/office/word/2010/wordml" xmlns:w15="http://schemas.microsoft.com/office/word/2012/wordml" xmlns:w16cex="http://schemas.microsoft.com/office/word/2018/wordml/cex" xmlns:w16cid="http://schemas.microsoft.com/office/word/2016/wordml/cid" xmlns:w16="http://schemas.microsoft.com/office/word/2018/wordml" xmlns:w16du="http://schemas.microsoft.com/office/word/2023/wordml/word16du" xmlns:w16sdtdh="http://schemas.microsoft.com/office/word/2020/wordml/sdtdatahash" xmlns:w16se="http://schemas.microsoft.com/office/word/2015/wordml/symex" xmlns:wpg="http://schemas.microsoft.com/office/word/2010/wordprocessingGroup" xmlns:wpi="http://schemas.microsoft.com/office/word/2010/wordprocessingInk" xmlns:wne="http://schemas.microsoft.com/office/word/2006/wordml" xmlns:wps="http://schemas.microsoft.com/office/word/2010/wordprocessingShape" mc:Ignorable="w14 w15 w16se w16cid w16 w16cex w16sdtdh wp14">
+<w:glossaryDocument xmlns:wpc="http://schemas.microsoft.com/office/word/2010/wordprocessingCanvas" xmlns:cx="http://schemas.microsoft.com/office/drawing/2014/chartex" xmlns:cx1="http://schemas.microsoft.com/office/drawing/2015/9/8/chartex" xmlns:cx2="http://schemas.microsoft.com/office/drawing/2015/10/21/chartex" xmlns:cx3="http://schemas.microsoft.com/office/drawing/2016/5/9/chartex" xmlns:cx4="http://schemas.microsoft.com/office/drawing/2016/5/10/chartex" xmlns:cx5="http://schemas.microsoft.com/office/drawing/2016/5/11/chartex" xmlns:cx6="http://schemas.microsoft.com/office/drawing/2016/5/12/chartex" xmlns:cx7="http://schemas.microsoft.com/office/drawing/2016/5/13/chartex" xmlns:cx8="http://schemas.microsoft.com/office/drawing/2016/5/14/chartex" xmlns:mc="http://schemas.openxmlformats.org/markup-compatibility/2006" xmlns:aink="http://schemas.microsoft.com/office/drawing/2016/ink" xmlns:am3d="http://schemas.microsoft.com/office/drawing/2017/model3d" xmlns:o="urn:schemas-microsoft-com:office:office" xmlns:oel="http://schemas.microsoft.com/office/2019/extlst" xmlns:r="http://schemas.openxmlformats.org/officeDocument/2006/relationships" xmlns:m="http://schemas.openxmlformats.org/officeDocument/2006/math" xmlns:v="urn:schemas-microsoft-com:vml" xmlns:wp14="http://schemas.microsoft.com/office/word/2010/wordprocessingDrawing" xmlns:wp="http://schemas.openxmlformats.org/drawingml/2006/wordprocessingDrawing" xmlns:w10="urn:schemas-microsoft-com:office:word" xmlns:w="http://schemas.openxmlformats.org/wordprocessingml/2006/main" xmlns:w14="http://schemas.microsoft.com/office/word/2010/wordml" xmlns:w15="http://schemas.microsoft.com/office/word/2012/wordml" xmlns:w16cex="http://schemas.microsoft.com/office/word/2018/wordml/cex" xmlns:w16cid="http://schemas.microsoft.com/office/word/2016/wordml/cid" xmlns:w16="http://schemas.microsoft.com/office/word/2018/wordml" xmlns:w16sdtdh="http://schemas.microsoft.com/office/word/2020/wordml/sdtdatahash" xmlns:w16se="http://schemas.microsoft.com/office/word/2015/wordml/symex" xmlns:wpg="http://schemas.microsoft.com/office/word/2010/wordprocessingGroup" xmlns:wpi="http://schemas.microsoft.com/office/word/2010/wordprocessingInk" xmlns:wne="http://schemas.microsoft.com/office/word/2006/wordml" xmlns:wps="http://schemas.microsoft.com/office/word/2010/wordprocessingShape" mc:Ignorable="w14 w15 w16se w16cid w16 w16cex w16sdtdh wp14">
   <w:docParts>
     <w:docPart>
       <w:docPartPr>
@@ -26658,6 +26851,7 @@
     <w:rsid w:val="006107C4"/>
     <w:rsid w:val="008226FC"/>
     <w:rsid w:val="00AF17B0"/>
+    <w:rsid w:val="00C27E2C"/>
   </w:rsids>
   <m:mathPr>
     <m:mathFont m:val="Cambria Math"/>
@@ -27117,31 +27311,6 @@
   <w:style w:type="paragraph" w:customStyle="1" w:styleId="E99FD5B3EAC34270BA2AEE29BB8C4FC6">
     <w:name w:val="E99FD5B3EAC34270BA2AEE29BB8C4FC6"/>
   </w:style>
-  <w:style w:type="paragraph" w:customStyle="1" w:styleId="60F34FF0416A4EE2ABD0143604CB291A">
-    <w:name w:val="60F34FF0416A4EE2ABD0143604CB291A"/>
-  </w:style>
-  <w:style w:type="paragraph" w:customStyle="1" w:styleId="28D907E540BB458FBF28EF2290D027D5">
-    <w:name w:val="28D907E540BB458FBF28EF2290D027D5"/>
-  </w:style>
-  <w:style w:type="paragraph" w:customStyle="1" w:styleId="TextRight">
-    <w:name w:val="TextRight"/>
-    <w:basedOn w:val="Normal"/>
-    <w:next w:val="Normal"/>
-    <w:uiPriority w:val="5"/>
-    <w:qFormat/>
-    <w:pPr>
-      <w:spacing w:after="0" w:line="288" w:lineRule="auto"/>
-    </w:pPr>
-    <w:rPr>
-      <w:rFonts w:eastAsiaTheme="minorHAnsi" w:cs="Times New Roman (Body CS)"/>
-      <w:color w:val="404040" w:themeColor="text1" w:themeTint="BF"/>
-      <w:szCs w:val="24"/>
-      <w:lang w:val="en-US" w:eastAsia="en-US"/>
-    </w:rPr>
-  </w:style>
-  <w:style w:type="paragraph" w:customStyle="1" w:styleId="755A2E71F9274DBEBA704ED3935286C5">
-    <w:name w:val="755A2E71F9274DBEBA704ED3935286C5"/>
-  </w:style>
   <w:style w:type="paragraph" w:customStyle="1" w:styleId="4FFDD858F8334537AA8EE67EA128DF15">
     <w:name w:val="4FFDD858F8334537AA8EE67EA128DF15"/>
   </w:style>
@@ -27357,12 +27526,11 @@
 </file>
 
 <file path=customXml/item1.xml><?xml version="1.0" encoding="utf-8"?>
-<?mso-contentType ?>
-<FormTemplates xmlns="http://schemas.microsoft.com/sharepoint/v3/contenttype/forms">
-  <Display>DocumentLibraryForm</Display>
-  <Edit>DocumentLibraryForm</Edit>
-  <New>DocumentLibraryForm</New>
-</FormTemplates>
+<p:properties xmlns:p="http://schemas.microsoft.com/office/2006/metadata/properties" xmlns:xsi="http://www.w3.org/2001/XMLSchema-instance" xmlns:pc="http://schemas.microsoft.com/office/infopath/2007/PartnerControls">
+  <documentManagement>
+    <MediaServiceKeyPoints xmlns="71af3243-3dd4-4a8d-8c0d-dd76da1f02a5" xsi:nil="true"/>
+  </documentManagement>
+</p:properties>
 </file>
 
 <file path=customXml/item2.xml><?xml version="1.0" encoding="utf-8"?>
@@ -27577,17 +27745,20 @@
 </file>
 
 <file path=customXml/item3.xml><?xml version="1.0" encoding="utf-8"?>
-<p:properties xmlns:p="http://schemas.microsoft.com/office/2006/metadata/properties" xmlns:xsi="http://www.w3.org/2001/XMLSchema-instance" xmlns:pc="http://schemas.microsoft.com/office/infopath/2007/PartnerControls">
-  <documentManagement>
-    <MediaServiceKeyPoints xmlns="71af3243-3dd4-4a8d-8c0d-dd76da1f02a5" xsi:nil="true"/>
-  </documentManagement>
-</p:properties>
+<?mso-contentType ?>
+<FormTemplates xmlns="http://schemas.microsoft.com/sharepoint/v3/contenttype/forms">
+  <Display>DocumentLibraryForm</Display>
+  <Edit>DocumentLibraryForm</Edit>
+  <New>DocumentLibraryForm</New>
+</FormTemplates>
 </file>
 
 <file path=customXml/itemProps1.xml><?xml version="1.0" encoding="utf-8"?>
-<ds:datastoreItem xmlns:ds="http://schemas.openxmlformats.org/officeDocument/2006/customXml" ds:itemID="{50503A21-F367-462E-B624-BDB4831C4953}">
+<ds:datastoreItem xmlns:ds="http://schemas.openxmlformats.org/officeDocument/2006/customXml" ds:itemID="{24285919-CFDE-4EB8-9796-0DEB1CB8315E}">
   <ds:schemaRefs>
-    <ds:schemaRef ds:uri="http://schemas.microsoft.com/sharepoint/v3/contenttype/forms"/>
+    <ds:schemaRef ds:uri="http://schemas.microsoft.com/office/2006/metadata/properties"/>
+    <ds:schemaRef ds:uri="http://schemas.microsoft.com/office/infopath/2007/PartnerControls"/>
+    <ds:schemaRef ds:uri="71af3243-3dd4-4a8d-8c0d-dd76da1f02a5"/>
   </ds:schemaRefs>
 </ds:datastoreItem>
 </file>
@@ -27612,11 +27783,9 @@
 </file>
 
 <file path=customXml/itemProps3.xml><?xml version="1.0" encoding="utf-8"?>
-<ds:datastoreItem xmlns:ds="http://schemas.openxmlformats.org/officeDocument/2006/customXml" ds:itemID="{24285919-CFDE-4EB8-9796-0DEB1CB8315E}">
+<ds:datastoreItem xmlns:ds="http://schemas.openxmlformats.org/officeDocument/2006/customXml" ds:itemID="{50503A21-F367-462E-B624-BDB4831C4953}">
   <ds:schemaRefs>
-    <ds:schemaRef ds:uri="http://schemas.microsoft.com/office/2006/metadata/properties"/>
-    <ds:schemaRef ds:uri="http://schemas.microsoft.com/office/infopath/2007/PartnerControls"/>
-    <ds:schemaRef ds:uri="71af3243-3dd4-4a8d-8c0d-dd76da1f02a5"/>
+    <ds:schemaRef ds:uri="http://schemas.microsoft.com/sharepoint/v3/contenttype/forms"/>
   </ds:schemaRefs>
 </ds:datastoreItem>
 </file>
</xml_diff>